<commit_message>
Refactor Word build script; expand lit review
Refactor build_word_manuscript.ps1 into Export-CocoaVolatilityWordManuscript with parameterized paths, resolved repo/source/output handling, safer pandoc invocation (&), and proper temp-file cleanup and logging. Add updated Word output and add a new conceptual support PDF (papers/conceptual_support/Commodity_price_pass-through_along_the_pricing_chain.pdf). Extend the disaster-resilience literature review (MD, TeX, and JSON manifest) to include resilience/vulnerability and value-chain citations (many new entries and DOI/manifest updates), bumping paper_count and updating retrieval metadata. Update generated paper artifacts (.aux, .bbl, .bib, .tex, .pdf) and minor script changes to reflect the expanded citations and review content.
</commit_message>
<xml_diff>
--- a/cocoa_volatility_manuscript_word.docx
+++ b/cocoa_volatility_manuscript_word.docx
@@ -9,8 +9,103 @@
       <w:r>
         <w:t>Cocoa Price Volatility and Smallholder Vulnerability Across the Supply Chain: Evidence from Colombia, International Benchmarks, and European Downstream Prices</w:t>
       </w:r>
-      <w:r>
-        <w:t xml:space="preserve"> (Working Paper)</w:t>
+    </w:p>
+    <w:p>
+      <w:pPr>
+        <w:pStyle w:val="Author"/>
+        <w:rPr>
+          <w:lang w:val="es-ES"/>
+        </w:rPr>
+      </w:pPr>
+      <w:r>
+        <w:rPr>
+          <w:lang w:val="es-ES"/>
+        </w:rPr>
+        <w:t>Leonardo H. Talero-Sarmiento</w:t>
+      </w:r>
+      <m:oMath>
+        <m:sSup>
+          <m:sSupPr>
+            <m:ctrlPr>
+              <w:rPr>
+                <w:rFonts w:ascii="Cambria Math" w:hAnsi="Cambria Math"/>
+              </w:rPr>
+            </m:ctrlPr>
+          </m:sSupPr>
+          <m:e>
+            <m:r>
+              <w:rPr>
+                <w:rFonts w:ascii="Cambria Math" w:hAnsi="Cambria Math"/>
+                <w:lang w:val="es-ES"/>
+              </w:rPr>
+              <m:t>​</m:t>
+            </m:r>
+          </m:e>
+          <m:sup>
+            <m:r>
+              <w:rPr>
+                <w:rFonts w:ascii="Cambria Math" w:hAnsi="Cambria Math"/>
+                <w:lang w:val="es-ES"/>
+              </w:rPr>
+              <m:t>1</m:t>
+            </m:r>
+          </m:sup>
+        </m:sSup>
+      </m:oMath>
+      <w:r>
+        <w:rPr>
+          <w:lang w:val="es-ES"/>
+        </w:rPr>
+        <w:t> </w:t>
+      </w:r>
+    </w:p>
+    <w:p>
+      <w:pPr>
+        <w:pStyle w:val="Author"/>
+        <w:rPr>
+          <w:lang w:val="es-ES"/>
+        </w:rPr>
+      </w:pPr>
+      <w:r>
+        <w:rPr>
+          <w:lang w:val="es-ES"/>
+        </w:rPr>
+        <w:t>Gabriel Weber</w:t>
+      </w:r>
+      <m:oMath>
+        <m:sSup>
+          <m:sSupPr>
+            <m:ctrlPr>
+              <w:rPr>
+                <w:rFonts w:ascii="Cambria Math" w:hAnsi="Cambria Math"/>
+              </w:rPr>
+            </m:ctrlPr>
+          </m:sSupPr>
+          <m:e>
+            <m:r>
+              <w:rPr>
+                <w:rFonts w:ascii="Cambria Math" w:hAnsi="Cambria Math"/>
+                <w:lang w:val="es-ES"/>
+              </w:rPr>
+              <m:t>​</m:t>
+            </m:r>
+          </m:e>
+          <m:sup>
+            <m:r>
+              <w:rPr>
+                <w:rFonts w:ascii="Cambria Math" w:hAnsi="Cambria Math"/>
+                <w:lang w:val="es-ES"/>
+              </w:rPr>
+              <m:t>2</m:t>
+            </m:r>
+          </m:sup>
+        </m:sSup>
+      </m:oMath>
+      <w:r>
+        <w:rPr>
+          <w:lang w:val="es-ES"/>
+        </w:rPr>
+        <w:t> </w:t>
       </w:r>
     </w:p>
     <w:p>
@@ -27,6 +122,96 @@
       </w:pPr>
       <w:r>
         <w:t>This study examines how cocoa price volatility is transmitted across the supply chain and what that transmission implies for smallholder vulnerability in Colombia. The paper examines whether movements in international cocoa benchmarks are transmitted to Colombian domestic cocoa prices and European downstream chocolate prices, and whether local weather conditions primarily drive price adjustments or serve as contextual factors that intensify vulnerability. To address this question, the study harmonizes monthly data from AgroNet weekly cacao reference prices for Colombia, the World Bank cocoa benchmark, Eurostat chocolate-price indicators, the COP/USD exchange rate, Brent oil prices, and NASA POWER weather variables for San Vicente de Chucurı́, Santander, the major cocoa department producer in Colombia. The empirical design combines long-run descriptive context with an aligned monthly estimation window for August 2021 to December 2025, using transparent block-specific imputation for isolated missing observations. Methods include log-return transformations, stationarity testing, HAC-robust level and return regressions, and exploratory transmission and vulnerability modeling with weather treated as a contextual extension. Preliminary results indicate that international cocoa prices are the dominant short-run driver of Colombian cocoa price changes, whereas the European downstream price index adjusts more slowly and less strongly. Weather variables add limited explanatory power to the core transmission models but strengthen the interpretation of smallholder vulnerability by capturing local environmental stress alongside market volatility.</w:t>
+      </w:r>
+    </w:p>
+    <w:p>
+      <w:pPr>
+        <w:pStyle w:val="FirstParagraph"/>
+        <w:rPr>
+          <w:lang w:val="es-ES"/>
+        </w:rPr>
+      </w:pPr>
+      <m:oMath>
+        <m:sSup>
+          <m:sSupPr>
+            <m:ctrlPr>
+              <w:rPr>
+                <w:rFonts w:ascii="Cambria Math" w:hAnsi="Cambria Math"/>
+              </w:rPr>
+            </m:ctrlPr>
+          </m:sSupPr>
+          <m:e>
+            <m:r>
+              <w:rPr>
+                <w:rFonts w:ascii="Cambria Math" w:hAnsi="Cambria Math"/>
+                <w:lang w:val="es-ES"/>
+              </w:rPr>
+              <m:t>​</m:t>
+            </m:r>
+          </m:e>
+          <m:sup>
+            <m:r>
+              <w:rPr>
+                <w:rFonts w:ascii="Cambria Math" w:hAnsi="Cambria Math"/>
+                <w:lang w:val="es-ES"/>
+              </w:rPr>
+              <m:t>1</m:t>
+            </m:r>
+          </m:sup>
+        </m:sSup>
+      </m:oMath>
+      <w:r>
+        <w:rPr>
+          <w:lang w:val="es-ES"/>
+        </w:rPr>
+        <w:t xml:space="preserve"> Universidad Autonoma de Bucaramanga, Colombia</w:t>
+      </w:r>
+      <w:r>
+        <w:rPr>
+          <w:lang w:val="es-ES"/>
+        </w:rPr>
+        <w:br/>
+      </w:r>
+      <m:oMath>
+        <m:sSup>
+          <m:sSupPr>
+            <m:ctrlPr>
+              <w:rPr>
+                <w:rFonts w:ascii="Cambria Math" w:hAnsi="Cambria Math"/>
+              </w:rPr>
+            </m:ctrlPr>
+          </m:sSupPr>
+          <m:e>
+            <m:r>
+              <w:rPr>
+                <w:rFonts w:ascii="Cambria Math" w:hAnsi="Cambria Math"/>
+                <w:lang w:val="es-ES"/>
+              </w:rPr>
+              <m:t>​</m:t>
+            </m:r>
+          </m:e>
+          <m:sup>
+            <m:r>
+              <w:rPr>
+                <w:rFonts w:ascii="Cambria Math" w:hAnsi="Cambria Math"/>
+                <w:lang w:val="es-ES"/>
+              </w:rPr>
+              <m:t>2</m:t>
+            </m:r>
+          </m:sup>
+        </m:sSup>
+      </m:oMath>
+      <w:r>
+        <w:rPr>
+          <w:lang w:val="es-ES"/>
+        </w:rPr>
+        <w:t xml:space="preserve"> ESSCA School of Management, France</w:t>
+      </w:r>
+      <w:r>
+        <w:rPr>
+          <w:lang w:val="es-ES"/>
+        </w:rPr>
+        <w:br/>
       </w:r>
     </w:p>
     <w:p>
@@ -58,7 +243,11 @@
         <w:pStyle w:val="FirstParagraph"/>
       </w:pPr>
       <w:r>
-        <w:t>Cocoa price volatility is not generated or absorbed at a single point in the supply chain. It emerges from the interaction among international benchmark movements, domestic producer-price adjustments, downstream food-price dynamics, macroeconomic conditions, and local production stress. For smallholder cocoa producers, the relevant question is not only whether prices rise or fall, but also how volatility is transmitted along the chain and how that transmission may intensify vulnerability at the farm level. Addressing that question requires an empirical design that connects the research question, the data architecture, and the estimation strategy in a transparent way.</w:t>
+        <w:t>Cocoa price volatility is not only a market outcome; in vulnerability and food-system resilience research, shocks matter because exposure interacts with sensitivity and adaptive capacity to shape harm (Tendall et al. 2015; Zurek et al. 2022). In cocoa-</w:t>
+      </w:r>
+      <w:r>
+        <w:lastRenderedPageBreak/>
+        <w:t>producing regions, producers face price instability together with climate stress and market positions that are often structurally weak. Cocoa studies report that producer concerns include price volatility, weak farmer organizations, dependence on few buyers, and climate-related production risks (Mithofer et al. 2017; Akrofi-Atitianti et al. 2018). Agroforestry research further shows that the loss of ecological buffering can reduce farmers’ ability to adapt to both cocoa price volatility and climate change (Vaast and Somarriba 2014). In that setting, vulnerability is shaped not simply by low prices, but by the interaction between transmitted market shocks and limited capacity to absorb them (Turner et al. 2003; Adger 2006; Tsowou and Gayi 2019).</w:t>
       </w:r>
     </w:p>
     <w:p>
@@ -66,8 +255,24 @@
         <w:pStyle w:val="Textoindependiente"/>
       </w:pPr>
       <w:r>
+        <w:t>That formulation raises a more specific analytical question: how do external shocks enter the livelihood system in the first place? Food-system analysis emphasizes that market, environmental, and institutional pressures interact across scales rather than arriving as isolated disturbances (Ericksen 2008; Zurek et al. 2022). Evidence from cocoa-market integration shows that producer exposure intensifies when reforms and market integration strengthen the link between world and domestic cocoa prices, even when farmers do not capture a commensurate share of the gains (Tsowou and Gayi 2019). Exchange-rate volatility can also alter cocoa price dynamics through the financial side of commodity markets, while broader pricing-chain evidence shows that commodity and energy shocks are transmitted unevenly to producer and consumer prices (Jumah and Kunst 2001; Jiménez-Rodrı́guez and Morales-Zumaquero 2022). Comparable evidence from coffee, another tropical perennial cash crop cultivated under similar climatic and organizational conditions, reinforces the broader point that adaptive capacity depends on value-chain organization and adaptation support rather than on farm-level decisions alone (Gereffi et al. 2005; Morales et al. 2022). The resilience problem is therefore not only climatic or institutional; it is also about the mechanism through which global volatility becomes local producer exposure (Merkle et al. 2021).</w:t>
+      </w:r>
+    </w:p>
+    <w:p>
+      <w:pPr>
+        <w:pStyle w:val="Textoindependiente"/>
+      </w:pPr>
+      <w:r>
+        <w:t>A parallel literature examines climate vulnerability and adaptation within cocoa systems. Cocoa vulnerability has been analysed in relation to climatic suitability and limits to adaptation (Schroth et al. 2016; Laderach et al. 2013), while physiological and farm-system studies show that cacao is sensitive to water and heat stress and that agroforestry can improve buffering capacity under climate pressure (Lahive et al. 2019; Niether et al. 2020; Jacobi et al. 2013; Vaast and Somarriba 2014). Comparable climate-risk work on coffee should be read as cross-crop rather than cocoa-specific evidence, but it supports the more general proposition that perennial tropical cash crops face spatially differentiated environmental risk and adaptation requirements (Koh et al. 2020; Laderach et al. 2016). Across the cocoa literature cited here, climate-oriented and market-oriented studies are usually operationalized separately: market studies focus on integration and pricing risk, while climate studies focus on suitability, physiology, and adaptation (Tsowou and Gayi 2019; Jumah and Kunst 2001; Schroth et al. 2016; Lahive et al. 2019). What remains less developed is an empirical design that links these environmental pressures to a formal analysis of benchmark transmission across the cocoa supply chain.</w:t>
+      </w:r>
+    </w:p>
+    <w:p>
+      <w:pPr>
+        <w:pStyle w:val="Textoindependiente"/>
+      </w:pPr>
+      <w:r>
         <w:lastRenderedPageBreak/>
-        <w:t>This paper examines whether movements in international cocoa benchmarks are transmitted to Colombian domestic cocoa prices and European downstream chocolate prices, and whether local weather conditions operate primarily as direct drivers of price adjustments or as contextual stressors that deepen smallholder vulnerability. That question is substantively important because producer exposure depends not only on average price levels but also on short-run volatility, exchange-rate pass-through, downstream adjustment lags, and the coincidence of market shocks with environmental stress. It is also methodologically important because the relevant series do not begin at the same date, do not come from a single source, and do not always exhibit the same frequency or completeness (Acosta et al. 2019; Hakkio and Rush 1991).</w:t>
+        <w:t>This paper addresses that gap by examining whether movements in international cocoa benchmarks are transmitted to Colombian domestic cocoa prices and European downstream chocolate prices, and whether local weather conditions act primarily as direct price drivers or as contextual stressors that deepen smallholder vulnerability. The contribution is threefold. First, the paper places producer-linked Colombian prices, world cocoa benchmarks, and European downstream chocolate prices in one aligned empirical framework, allowing the supply chain to be analysed as a transmission system rather than as disconnected markets (Acosta et al. 2019; Jiménez-Rodrı́guez and Morales-Zumaquero 2022). Second, it links that transmission question to resilience by treating weather as local context that can amplify exposure even when it does not dominate short-run price formation, consistent with vulnerability frameworks that distinguish exposure from the conditions that shape realized harm (Turner et al. 2003; Adger 2006). Third, it makes the data architecture explicit by distinguishing between long historical coverage and the shorter common estimation window, and by documenting missingness and imputation transparently rather than treating them as invisible preprocessing steps (Troyanskaya et al. 2001; Buuren and Groothuis-Oudshoorn 2011; Hakkio and Rush 1991).</w:t>
       </w:r>
     </w:p>
     <w:p>
@@ -75,7 +280,7 @@
         <w:pStyle w:val="Textoindependiente"/>
       </w:pPr>
       <w:r>
-        <w:t>To address this problem, the paper develops the data context and the methods in tandem. The dataset combines Colombian domestic cocoa prices from AgroNet’s official weekly cacao reference series (Ministerio de Agricultura y Desarrollo Rural 2026), the World Bank international cocoa benchmark (World Bank Prospects Group 2025), European downstream chocolate-price indicators from Eurostat (Eurostat 2026), macro controls from the COP/USD exchange-rate system and Brent oil prices (Banco de la Republica 2026; U.S. Energy Information Administration 2026), and a local weather block for San Vicente de Chucurı́, Santander, from NASA POWER (National Aeronautics and Space Administration 2026). This structure allows the paper to distinguish between a broader historical context and a shorter aligned monthly window for direct cross-series estimation. That distinction is central to the credibility of the design because it avoids imposing artificial comparability across series with uneven histories while preserving a coherent empirical core.</w:t>
+        <w:t>Read through the lens of the manuscript’s empirical design, the gap can be stated as three linked questions. First, how strongly are international cocoa shocks transmitted to producer-linked Colombian prices once exchange-rate movements and oil-price conditions are taken into account, and how does that adjustment compare with downstream European chocolate prices? Second, does the supply chain distribute adjustment unevenly, leaving producer-linked prices more exposed than downstream consumer prices? Third, can localized weather variability be incorporated as vulnerability-relevant context without conflating environmental stress with the core market-adjustment mechanism? These questions structure the Introduction, Literature Review, and Discussion, and they also delimit the scope of the paper’s claims.</w:t>
       </w:r>
     </w:p>
     <w:p>
@@ -83,7 +288,7 @@
         <w:pStyle w:val="Textoindependiente"/>
       </w:pPr>
       <w:r>
-        <w:t>The paper also treats missingness and temporal alignment as substantive design choices rather than invisible preprocessing steps. In the current aligned sample, missing observations are isolated and limited, allowing transparent comparison of imputation alternatives without obscuring the original block structure. Instead of silently dropping months or filling them without documentation, the workflow preserves explicit imputation candidates and keeps sensitivity analysis open for later model refinement (Troyanskaya et al. 2001; Buuren and Groothuis-Oudshoorn 2011). This is especially relevant in a study that aims to compare transmission across producer, benchmark, downstream, macro, and weather series within a shared monthly framework.</w:t>
+        <w:t>For empirical transparency, the manuscript translates these three gap questions into four working hypotheses that are tested provisionally in the current draft. H1 expects positive short-run transmission from world cocoa returns to Colombian cocoa returns. H2 expects downstream European chocolate prices to show weaker and slower short-run adjustment than producer-linked Colombian prices. H3 expects localized weather variables to add vulnerability-relevant context without displacing benchmark transmission in the core models. H4 treats a climate-augmented cointegration design as conceptually relevant but empirically fragile under the current short weather overlap. The hypotheses therefore operationalize the gap rather than replacing it.</w:t>
       </w:r>
     </w:p>
     <w:p>
@@ -91,7 +296,11 @@
         <w:pStyle w:val="Textoindependiente"/>
       </w:pPr>
       <w:r>
-        <w:t>Methodologically, the empirical strategy focuses first on price transmission and then on vulnerability interpretation. The core analysis relies on log transformations, return construction, stationarity testing, and HAC-robust regressions to evaluate short-run transmission across the supply chain. Weather variables are not introduced as substitutes for market analysis, but as local contextual extensions that help distinguish between direct price drivers and vulnerability-amplifying stressors. In this sense, the paper keeps a clear analytical separation between the market-transmission question and the broader sustainability and vulnerability question, while also allowing the two to be interpreted jointly (Engle and Granger 1987; Johansen 1991; Talero-Sarmiento et al. 2025).</w:t>
+        <w:t xml:space="preserve">Methodologically, the empirical strategy focuses first on price transmission and then on vulnerability interpretation. The core analysis relies on log transformations, return construction, stationarity testing, and HAC-robust regressions to evaluate short-run transmission across the supply chain. Weather variables are not introduced as substitutes for market analysis, but as local contextual extensions that help distinguish between direct price drivers and vulnerability-amplifying stressors, in line with vulnerability frameworks that separate exposure from sensitivity and adaptive capacity (Turner et al. 2003; Adger </w:t>
+      </w:r>
+      <w:r>
+        <w:lastRenderedPageBreak/>
+        <w:t>2006). This analytical separation is important because it allows the paper to contribute to the resilience literature without overstating what can be inferred from a short aligned sample.</w:t>
       </w:r>
     </w:p>
     <w:p>
@@ -99,8 +308,7 @@
         <w:pStyle w:val="Textoindependiente"/>
       </w:pPr>
       <w:r>
-        <w:lastRenderedPageBreak/>
-        <w:t>Preliminary results suggest that international cocoa prices are the strongest short-run driver of Colombian domestic cocoa price changes, while European downstream prices adjust more slowly and more weakly. Macro controls help frame the transmission environment, whereas the weather block adds more interpretive value to vulnerability than explanatory power to the core transmission equations. These early findings support the title’s emphasis on supply-chain volatility and smallholder vulnerability, while also indicating that the climate dimension is better justified at this stage as local context than as the main engine of price formation.</w:t>
+        <w:t>Preliminary results suggest that international cocoa prices are the strongest short-run driver of Colombian domestic cocoa price changes, while European downstream prices adjust more slowly and more weakly. Macro controls help frame the transmission environment, whereas the weather block adds more interpretive value to vulnerability than explanatory power to the core transmission equations. These early findings support the paper’s central claim that vulnerability in the cocoa chain is shaped by transmitted market instability interacting with local stress conditions.</w:t>
       </w:r>
     </w:p>
     <w:p>
@@ -108,9 +316,9 @@
         <w:pStyle w:val="Textoindependiente"/>
       </w:pPr>
       <w:r>
-        <w:t>The rest of the draft is organized as follows. Section </w:t>
-      </w:r>
-      <w:hyperlink w:anchor="sec:methods">
+        <w:t>The remainder of the manuscript is organized as follows. Section </w:t>
+      </w:r>
+      <w:hyperlink w:anchor="sec:litreview">
         <w:r>
           <w:rPr>
             <w:rStyle w:val="Hipervnculo"/>
@@ -119,9 +327,9 @@
         </w:r>
       </w:hyperlink>
       <w:r>
-        <w:t xml:space="preserve"> presents the data design, transformations, equations, imputation strategy, and the two empirical approaches. Section </w:t>
-      </w:r>
-      <w:hyperlink w:anchor="sec:results">
+        <w:t xml:space="preserve"> synthesizes the relevant literature on disasters, resilience, adaptation, and risk measurement. Section </w:t>
+      </w:r>
+      <w:hyperlink w:anchor="sec:methods">
         <w:r>
           <w:rPr>
             <w:rStyle w:val="Hipervnculo"/>
@@ -130,9 +338,9 @@
         </w:r>
       </w:hyperlink>
       <w:r>
-        <w:t xml:space="preserve"> reports preliminary descriptive, stationarity, transmission, and vulnerability results using the current aligned panel. Section </w:t>
-      </w:r>
-      <w:hyperlink w:anchor="sec:discussion">
+        <w:t xml:space="preserve"> presents the data design, transformations, equations, imputation strategy, and the two empirical approaches. Section </w:t>
+      </w:r>
+      <w:hyperlink w:anchor="sec:results">
         <w:r>
           <w:rPr>
             <w:rStyle w:val="Hipervnculo"/>
@@ -141,7 +349,36 @@
         </w:r>
       </w:hyperlink>
       <w:r>
-        <w:t xml:space="preserve"> discusses limitations and the implications for the next modeling stage.</w:t>
+        <w:t xml:space="preserve"> reports preliminary descriptive, stationarity, transmission, and vulnerability results using the current aligned panel. Section </w:t>
+      </w:r>
+      <w:hyperlink w:anchor="sec:discussion">
+        <w:r>
+          <w:rPr>
+            <w:rStyle w:val="Hipervnculo"/>
+          </w:rPr>
+          <w:t>5</w:t>
+        </w:r>
+      </w:hyperlink>
+      <w:r>
+        <w:t xml:space="preserve"> interprets the findings in relation to the identified gap, clarifies limitations, and discusses the implications for the next modeling stage.</w:t>
+      </w:r>
+    </w:p>
+    <w:p>
+      <w:pPr>
+        <w:pStyle w:val="Ttulo1"/>
+      </w:pPr>
+      <w:bookmarkStart w:id="1" w:name="sec:litreview"/>
+      <w:bookmarkEnd w:id="0"/>
+      <w:r>
+        <w:t>Literature Review</w:t>
+      </w:r>
+    </w:p>
+    <w:p>
+      <w:pPr>
+        <w:pStyle w:val="FirstParagraph"/>
+      </w:pPr>
+      <w:r>
+        <w:t>The Introduction established the paper’s central claim: resilience in cocoa systems cannot be understood only through climate stress or only through prices, because producer vulnerability is shaped by how external shocks are transmitted and absorbed. That formulation is consistent with vulnerability frameworks in which harm depends on both exposure and the capacity of the affected system to respond (Turner et al. 2003; Adger 2006). The literature review sharpens that point by showing that the relevant gap is threefold and internally connected.</w:t>
       </w:r>
     </w:p>
     <w:p>
@@ -149,134 +386,61 @@
         <w:pStyle w:val="Textoindependiente"/>
       </w:pPr>
       <w:r>
-        <w:t>Gabriel, here are a few questions and ideas that could help us strengthen the paper with the other co-authors. At this stage, the draft still feels primarily statistical, so we should develop the research side more clearly.</w:t>
-      </w:r>
-    </w:p>
-    <w:p>
-      <w:pPr>
-        <w:numPr>
-          <w:ilvl w:val="0"/>
-          <w:numId w:val="2"/>
-        </w:numPr>
-      </w:pPr>
-      <w:r>
-        <w:t>Why is each data source necessary for our argument?</w:t>
-      </w:r>
-    </w:p>
-    <w:p>
-      <w:pPr>
-        <w:numPr>
-          <w:ilvl w:val="0"/>
-          <w:numId w:val="2"/>
-        </w:numPr>
-      </w:pPr>
-      <w:r>
-        <w:t>What do we mean by smallholder vulnerability here?</w:t>
-      </w:r>
-    </w:p>
-    <w:p>
-      <w:pPr>
-        <w:numPr>
-          <w:ilvl w:val="0"/>
-          <w:numId w:val="2"/>
-        </w:numPr>
-      </w:pPr>
-      <w:r>
-        <w:t>How does volatility relate to sustainability and resilience?</w:t>
-      </w:r>
-    </w:p>
-    <w:p>
-      <w:pPr>
-        <w:numPr>
-          <w:ilvl w:val="0"/>
-          <w:numId w:val="2"/>
-        </w:numPr>
-      </w:pPr>
-      <w:r>
-        <w:t>Are we representing the supply chain too simply?</w:t>
-      </w:r>
-    </w:p>
-    <w:p>
-      <w:pPr>
-        <w:numPr>
-          <w:ilvl w:val="0"/>
-          <w:numId w:val="2"/>
-        </w:numPr>
-      </w:pPr>
-      <w:r>
-        <w:t>What is the exact role of European downstream prices in the paper?</w:t>
-      </w:r>
-    </w:p>
-    <w:p>
-      <w:pPr>
-        <w:numPr>
-          <w:ilvl w:val="0"/>
-          <w:numId w:val="2"/>
-        </w:numPr>
-      </w:pPr>
-      <w:r>
-        <w:t>What is the best way to frame weather variables in the analysis?</w:t>
-      </w:r>
-    </w:p>
-    <w:p>
-      <w:pPr>
-        <w:numPr>
-          <w:ilvl w:val="0"/>
-          <w:numId w:val="2"/>
-        </w:numPr>
-      </w:pPr>
-      <w:r>
-        <w:t>Can we justify the chosen time window more directly?</w:t>
-      </w:r>
-    </w:p>
-    <w:p>
-      <w:pPr>
-        <w:numPr>
-          <w:ilvl w:val="0"/>
-          <w:numId w:val="2"/>
-        </w:numPr>
-      </w:pPr>
-      <w:r>
-        <w:t>What is the main contribution of the paper beyond the empirical exercise?</w:t>
-      </w:r>
-    </w:p>
-    <w:p>
-      <w:pPr>
-        <w:numPr>
-          <w:ilvl w:val="0"/>
-          <w:numId w:val="2"/>
-        </w:numPr>
-      </w:pPr>
-      <w:r>
-        <w:t>Should we emphasize more clearly that the results are still preliminary?</w:t>
-      </w:r>
-    </w:p>
-    <w:p>
-      <w:pPr>
-        <w:numPr>
-          <w:ilvl w:val="0"/>
-          <w:numId w:val="2"/>
-        </w:numPr>
-      </w:pPr>
-      <w:r>
-        <w:t>Would one explicit hypothesis improve the structure of the paper?</w:t>
+        <w:t>The first element of the gap concerns transmission itself. Cocoa studies explain market integration, pass-through, and exchange-rate exposure, but they rarely embed those processes in a resilience framework. Existing evidence shows that deeper integration into world markets can increase farmer exposure to international volatility, while exchange-rate conditions reshape cocoa price risk through distinct commodity-market channels (Tsowou and Gayi 2019; Jumah and Kunst 2001). More broadly, price-transmission research shows that pass-through along pricing chains is often partial, heterogeneous, and method-sensitive (Meyer and Cramon-Taubadel 2004; Acosta et al. 2019). These findings justify modelling world cocoa prices and the COP/USD rate as separate transmission channels rather than treating external volatility as an undifferentiated shock. At the same time, they leave open the question of how far benchmark shocks travel across linked market layers once producer and downstream prices are examined together.</w:t>
+      </w:r>
+    </w:p>
+    <w:p>
+      <w:pPr>
+        <w:pStyle w:val="Textoindependiente"/>
+      </w:pPr>
+      <w:r>
+        <w:t xml:space="preserve">The second element concerns where adjustment is absorbed along the chain. Global value-chain and food-system research suggest that vulnerability is not simply an attribute </w:t>
+      </w:r>
+      <w:r>
+        <w:lastRenderedPageBreak/>
+        <w:t>of producers; it is also shaped by how institutions, market power, and support systems distribute adjustment across actors (Gereffi et al. 2005; Merkle et al. 2021). Producer concerns in cocoa commonly include price volatility, weak farmer organizations, dependence on few buyers, and limited alignment between interventions and producer priorities (Mithofer et al. 2017). Comparative work on coffee value chains, used here only as evidence from a similar tropical tree-crop system, reaches a related conclusion by showing that adaptive capacity depends on coordination, support, and innovation across the chain (Morales et al. 2022; Verburg et al. 2019). More general pricing-chain evidence also suggests that commodity shocks need not pass through symmetrically across market layers (Meyer and Cramon-Taubadel 2004; Jiménez-Rodrı́guez and Morales-Zumaquero 2022). This combined evidence implies that adjustment may be experienced differently across actors, but the retained cocoa studies used in this manuscript do not jointly estimate benchmark, producer-linked, and downstream consumer prices in one aligned monthly framework (Tsowou and Gayi 2019; Jumah and Kunst 2001).</w:t>
+      </w:r>
+    </w:p>
+    <w:p>
+      <w:pPr>
+        <w:pStyle w:val="Textoindependiente"/>
+      </w:pPr>
+      <w:r>
+        <w:t>The third element concerns the status of weather in the analysis. In vulnerability analysis, exposure to hazards is analytically distinct from the sensitivity and resilience of the affected system (Turner et al. 2003; Adger 2006). Climate-resilience research documents environmental stress in cocoa systems, but usually without linking that stress to formal price-transmission analysis. Cocoa-specific studies show that vulnerability depends on climatic suitability, physiological sensitivity, and ecological design, with agroforestry improving buffering capacity under heat and moisture stress (Schroth et al. 2016; Lahive et al. 2019; Niether et al. 2020). Comparable climate-risk work on coffee, interpreted cautiously as cross-crop evidence, supports the more general proposition that adaptation requirements are spatially differentiated across perennial tropical cash-crop systems (Koh et al. 2020; Laderach et al. 2016). Prior local cocoa modelling further supports the NASA POWER weather architecture used here for San Vicente de Chucurı́ (Talero-Sarmiento et al. 2025). Together, these studies justify treating weather as contextual stress in the present paper, but they do not show that local weather should replace benchmark transmission as the dominant short-run mechanism.</w:t>
+      </w:r>
+    </w:p>
+    <w:p>
+      <w:pPr>
+        <w:pStyle w:val="Textoindependiente"/>
+      </w:pPr>
+      <w:r>
+        <w:t>The gap is therefore not the absence of climate research or market research in isolation, but the absence of a design that links them without overstating causality. Across the strands reviewed above, transmission, chain governance, and environmental stress are usually analysed separately rather than in one aligned empirical system (Tsowou and Gayi 2019; Schroth et al. 2016; Mithofer et al. 2017). This paper responds by estimating transmission from international cocoa benchmarks to Colombian producer-linked prices, comparing that adjustment with a downstream European chocolate price index, and then using localized weather indicators to interpret when market-driven exposure is experienced under stronger environmental stress. The methodological contribution lies in keeping those layers analytically distinct: transmission is identified in the core models, whereas weather enters as a contextual extension under explicit sample limits.</w:t>
       </w:r>
     </w:p>
     <w:p>
       <w:pPr>
         <w:pStyle w:val="Ttulo1"/>
       </w:pPr>
-      <w:bookmarkStart w:id="1" w:name="sec:methods"/>
-      <w:bookmarkEnd w:id="0"/>
-      <w:r>
+      <w:bookmarkStart w:id="2" w:name="sec:methods"/>
+      <w:bookmarkEnd w:id="1"/>
+      <w:r>
+        <w:lastRenderedPageBreak/>
         <w:t>Materials and Methods</w:t>
       </w:r>
     </w:p>
     <w:p>
       <w:pPr>
+        <w:pStyle w:val="FirstParagraph"/>
+      </w:pPr>
+      <w:r>
+        <w:t>The methods section is organized to align directly with the paper’s three gap questions. The first empirical block identifies benchmark transmission by modelling Colombian cocoa prices as a function of world cocoa prices together with the COP/USD exchange rate and Brent oil prices, because cocoa price dynamics are exposed to broader macro-financial conditions rather than to the benchmark alone (Jumah and Kunst 2001; Jiménez-Rodrı́guez and Morales-Zumaquero 2022). The second block compares that producer-linked adjustment with the European downstream chocolate index in order to test whether the supply chain distributes shocks unevenly across actors, a concern consistent with literature on chain governance, market power, and weak producer leverage (Gereffi et al. 2005; Mithofer et al. 2017; Merkle et al. 2021). The third block adds localized NASA POWER weather indicators as a contextual extension. The broader weather block follows prior local cocoa water-stress modelling for San Vicente de Chucurı́, while the present manuscript uses those indicators to examine whether environmental stress sharpens vulnerability without overstating weather as the dominant short-run price mechanism (Turner et al. 2003; Talero-Sarmiento et al. 2025; Lahive et al. 2019). This sequencing is deliberate: prices and macro controls identify transmission, downstream prices identify supply-chain adjustment, and weather identifies the local stress setting in which that adjustment is experienced.</w:t>
+      </w:r>
+    </w:p>
+    <w:p>
+      <w:pPr>
         <w:pStyle w:val="Ttulo2"/>
       </w:pPr>
-      <w:bookmarkStart w:id="2" w:name="data-architecture-and-sample-design"/>
+      <w:bookmarkStart w:id="3" w:name="data-architecture-and-sample-design"/>
       <w:r>
         <w:t>Data Architecture and Sample Design</w:t>
       </w:r>
@@ -286,36 +450,33 @@
         <w:pStyle w:val="FirstParagraph"/>
       </w:pPr>
       <w:r>
-        <w:t xml:space="preserve">The empirical design combines a long historical data repository with a shorter aligned sample for direct cross-series estimation. At the repository level, the merged monthly panel currently contains 795 observations spanning January 1960 to March 2026. This broader panel is useful for historical context, descriptive inspection, and source </w:t>
-      </w:r>
+        <w:t>The empirical design combines a long historical data repository with a shorter aligned sample for direct cross-series estimation. At the repository level, the merged monthly panel currently contains 795 observations spanning January 1960 to March 2026. This broader panel is useful for historical context, descriptive inspection, and source integration. However, the main econometric analysis cannot rely on the full period because the relevant series do not begin or end at the same time.</w:t>
+      </w:r>
+    </w:p>
+    <w:p>
+      <w:pPr>
+        <w:pStyle w:val="Textoindependiente"/>
+      </w:pPr>
+      <w:r>
+        <w:t>The principal constraint comes from the Colombian domestic cocoa series, which begins in August 2021, and the Eurostat downstream chocolate index, which currently extends through December 2025. As a result, the common calendar window for the core transmission system runs from August 2021 to December 2025 and contains 53 monthly observations. Within this interval, the balanced non-imputed core sample contains 52 complete observations for Colombian cocoa prices, the world cocoa benchmark, the EU chocolate index, the COP/USD exchange rate, and Brent oil prices. When the weather block is added, the sample size drops to 51 observations because the solar-radiation series is missing for December 2025.</w:t>
+      </w:r>
+    </w:p>
+    <w:p>
+      <w:pPr>
+        <w:pStyle w:val="Textoindependiente"/>
+      </w:pPr>
+      <w:r>
+        <w:t>This distinction between the full historical panel and the aligned estimation window is central to the empirical strategy. The longer span preserves historical depth and permits descriptive context, whereas the shorter common window ensures comparability across the core variables used in the transmission analysis. The design, therefore, avoids conflating broad historical coverage with effective econometric overlap.</w:t>
+      </w:r>
+    </w:p>
+    <w:p>
+      <w:pPr>
+        <w:pStyle w:val="Ttulo2"/>
+      </w:pPr>
+      <w:bookmarkStart w:id="4" w:name="variable-data-card"/>
+      <w:bookmarkEnd w:id="3"/>
       <w:r>
         <w:lastRenderedPageBreak/>
-        <w:t>integration. However, the main econometric analysis cannot rely on the full period because the relevant series do not begin or end at the same time.</w:t>
-      </w:r>
-    </w:p>
-    <w:p>
-      <w:pPr>
-        <w:pStyle w:val="Textoindependiente"/>
-      </w:pPr>
-      <w:r>
-        <w:t>The principal constraint comes from the Colombian domestic cocoa series, which begins in August 2021, and the Eurostat downstream chocolate index, which currently extends through December 2025. As a result, the common calendar window for the core transmission system runs from August 2021 to December 2025 and contains 53 monthly observations. Within this interval, the balanced non-imputed core sample contains 52 complete observations for Colombian cocoa prices, the world cocoa benchmark, the EU chocolate index, the COP/USD exchange rate, and Brent oil prices. When the weather block is added, the sample size drops to 51 observations because the solar-radiation series is missing for December 2025.</w:t>
-      </w:r>
-    </w:p>
-    <w:p>
-      <w:pPr>
-        <w:pStyle w:val="Textoindependiente"/>
-      </w:pPr>
-      <w:r>
-        <w:t>This distinction between the full historical panel and the aligned estimation window is central to the empirical strategy. The longer span preserves historical depth and permits descriptive context, whereas the shorter common window ensures comparability across the core variables used in the transmission analysis. The design, therefore, avoids conflating broad historical coverage with effective econometric overlap.</w:t>
-      </w:r>
-    </w:p>
-    <w:p>
-      <w:pPr>
-        <w:pStyle w:val="Ttulo2"/>
-      </w:pPr>
-      <w:bookmarkStart w:id="3" w:name="variable-data-card"/>
-      <w:bookmarkEnd w:id="2"/>
-      <w:r>
         <w:t>Variable Data Card</w:t>
       </w:r>
     </w:p>
@@ -343,14 +504,14 @@
         <w:pStyle w:val="Textoindependiente"/>
       </w:pPr>
       <w:r>
-        <w:t>The weather variables are included as a separate local block centred on San Vicente de Chucurı́, Santander. In the current draft, these variables are used primarily to support the interpretation of vulnerability rather than to define the core transmission system itself. Precipitation, air temperature, maximum and minimum temperature, relative humidity, wind speed, and solar radiation remain available for descriptive analysis, contextual interpretation, and robustness extensions.</w:t>
+        <w:t>The weather variables are included as a separate local block centred on San Vicente de Chucurı́, Santander. In the current draft, these variables are used primarily to support the interpretation of vulnerability rather than to define the core transmission system itself. The use of the NASA POWER block is also consistent with prior local cocoa modelling for the same municipality (Talero-Sarmiento et al. 2025). Precipitation, air temperature, maximum and minimum temperature, relative humidity, wind speed, and solar radiation remain available for descriptive analysis, contextual interpretation, and robustness extensions.</w:t>
       </w:r>
     </w:p>
     <w:p>
       <w:pPr>
         <w:pStyle w:val="TableCaption"/>
       </w:pPr>
-      <w:bookmarkStart w:id="4" w:name="tab:data_card"/>
+      <w:bookmarkStart w:id="5" w:name="tab:data_card"/>
       <w:r>
         <w:t>Variable data card for the current manuscript draft</w:t>
       </w:r>
@@ -360,13 +521,14 @@
         <w:tblStyle w:val="Table"/>
         <w:tblW w:w="0" w:type="auto"/>
         <w:tblLook w:val="0020" w:firstRow="1" w:lastRow="0" w:firstColumn="0" w:lastColumn="0" w:noHBand="0" w:noVBand="0"/>
+        <w:tblCaption w:val="Variable data card for the current manuscript draft"/>
       </w:tblPr>
       <w:tblGrid>
-        <w:gridCol w:w="1834"/>
-        <w:gridCol w:w="2944"/>
+        <w:gridCol w:w="1811"/>
+        <w:gridCol w:w="2838"/>
         <w:gridCol w:w="1373"/>
-        <w:gridCol w:w="1569"/>
-        <w:gridCol w:w="1856"/>
+        <w:gridCol w:w="1546"/>
+        <w:gridCol w:w="1792"/>
       </w:tblGrid>
       <w:tr>
         <w:trPr>
@@ -650,7 +812,6 @@
               <w:pStyle w:val="Compact"/>
             </w:pPr>
             <w:r>
-              <w:lastRenderedPageBreak/>
               <w:t>EU chocolate index</w:t>
             </w:r>
           </w:p>
@@ -1113,6 +1274,7 @@
               <w:pStyle w:val="Compact"/>
             </w:pPr>
             <w:r>
+              <w:lastRenderedPageBreak/>
               <w:t>NASA min temperature</w:t>
             </w:r>
           </w:p>
@@ -1436,8 +1598,8 @@
       <w:pPr>
         <w:pStyle w:val="TableCaption"/>
       </w:pPr>
-      <w:bookmarkStart w:id="5" w:name="tab:sample_design"/>
-      <w:bookmarkEnd w:id="4"/>
+      <w:bookmarkStart w:id="6" w:name="tab:sample_design"/>
+      <w:bookmarkEnd w:id="5"/>
       <w:r>
         <w:t>Sample design and imputation structure</w:t>
       </w:r>
@@ -1447,12 +1609,13 @@
         <w:tblStyle w:val="Table"/>
         <w:tblW w:w="0" w:type="auto"/>
         <w:tblLook w:val="0020" w:firstRow="1" w:lastRow="0" w:firstColumn="0" w:lastColumn="0" w:noHBand="0" w:noVBand="0"/>
+        <w:tblCaption w:val="Sample design and imputation structure"/>
       </w:tblPr>
       <w:tblGrid>
-        <w:gridCol w:w="2671"/>
+        <w:gridCol w:w="2617"/>
         <w:gridCol w:w="712"/>
-        <w:gridCol w:w="1463"/>
-        <w:gridCol w:w="4730"/>
+        <w:gridCol w:w="1436"/>
+        <w:gridCol w:w="4595"/>
       </w:tblGrid>
       <w:tr>
         <w:trPr>
@@ -1837,13 +2000,12 @@
         </w:tc>
       </w:tr>
     </w:tbl>
-    <w:bookmarkEnd w:id="5"/>
+    <w:bookmarkEnd w:id="6"/>
     <w:p>
       <w:pPr>
         <w:pStyle w:val="Textoindependiente"/>
       </w:pPr>
       <w:r>
-        <w:lastRenderedPageBreak/>
         <w:t>Table </w:t>
       </w:r>
       <w:hyperlink w:anchor="tab:sample_design">
@@ -1870,9 +2032,10 @@
       <w:pPr>
         <w:pStyle w:val="Ttulo2"/>
       </w:pPr>
-      <w:bookmarkStart w:id="6" w:name="transformations"/>
-      <w:bookmarkEnd w:id="3"/>
-      <w:r>
+      <w:bookmarkStart w:id="7" w:name="transformations"/>
+      <w:bookmarkEnd w:id="4"/>
+      <w:r>
+        <w:lastRenderedPageBreak/>
         <w:t>Transformations</w:t>
       </w:r>
     </w:p>
@@ -2194,8 +2357,8 @@
       <w:pPr>
         <w:pStyle w:val="Ttulo2"/>
       </w:pPr>
-      <w:bookmarkStart w:id="7" w:name="imputation-strategy"/>
-      <w:bookmarkEnd w:id="6"/>
+      <w:bookmarkStart w:id="8" w:name="imputation-strategy"/>
+      <w:bookmarkEnd w:id="7"/>
       <w:r>
         <w:t>Imputation Strategy</w:t>
       </w:r>
@@ -2527,7 +2690,6 @@
         <w:pStyle w:val="FirstParagraph"/>
       </w:pPr>
       <w:r>
-        <w:lastRenderedPageBreak/>
         <w:t xml:space="preserve">where </w:t>
       </w:r>
       <m:oMath>
@@ -2630,15 +2792,19 @@
         <w:pStyle w:val="Textoindependiente"/>
       </w:pPr>
       <w:r>
-        <w:t>In the current aligned sample, missingness is limited. The main missing observation in the price block occurs for Colombian cocoa in 2025-09 and is estimated at 27,134.89 under KNN and 23,855.55 under iterative imputation. In the weather block, the missing solar-radiation value for 2025-12 is estimated to be 18.392 using KNN and 18.387 using iterative imputation. The relatively small number of missing values allows the study to preserve transparency while maintaining continuity for graphical and econometric analysis.</w:t>
+        <w:t>In the current aligned sample, missingness is limited. The main missing observation in the price block occurs for Colombian cocoa in 2025-09 and is estimated at 27,134.89 under KNN and 23,855.55 under iterative imputation. In the weather block, the missing solar-</w:t>
+      </w:r>
+      <w:r>
+        <w:lastRenderedPageBreak/>
+        <w:t>radiation value for 2025-12 is estimated to be 18.392 using KNN and 18.387 using iterative imputation. The relatively small number of missing values allows the study to preserve transparency while maintaining continuity for graphical and econometric analysis.</w:t>
       </w:r>
     </w:p>
     <w:p>
       <w:pPr>
         <w:pStyle w:val="Ttulo2"/>
       </w:pPr>
-      <w:bookmarkStart w:id="8" w:name="core-transmission-equations"/>
-      <w:bookmarkEnd w:id="7"/>
+      <w:bookmarkStart w:id="9" w:name="core-transmission-equations"/>
+      <w:bookmarkEnd w:id="8"/>
       <w:r>
         <w:t>Core Transmission Equations</w:t>
       </w:r>
@@ -3537,8 +3703,8 @@
       <w:pPr>
         <w:pStyle w:val="Ttulo2"/>
       </w:pPr>
-      <w:bookmarkStart w:id="9" w:name="two-weather-strategies"/>
-      <w:bookmarkEnd w:id="8"/>
+      <w:bookmarkStart w:id="10" w:name="two-weather-strategies"/>
+      <w:bookmarkEnd w:id="9"/>
       <w:r>
         <w:t>Two Weather Strategies</w:t>
       </w:r>
@@ -3548,11 +3714,7 @@
         <w:pStyle w:val="FirstParagraph"/>
       </w:pPr>
       <w:r>
-        <w:t xml:space="preserve">The role of weather is treated cautiously and explicitly in order to avoid overstating what can be inferred from the available overlap. The first strategy treats weather as contextual vulnerability information rather than as a core determinant of the main transmission </w:t>
-      </w:r>
-      <w:r>
-        <w:lastRenderedPageBreak/>
-        <w:t>system. Under this approach, lagged weather indicators are introduced as additional covariates around the domestic-price model:</w:t>
+        <w:t>The role of weather is treated cautiously and explicitly in order to avoid overstating what can be inferred from the available overlap. The first strategy treats weather as contextual vulnerability information rather than as a core determinant of the main transmission system, consistent with frameworks that distinguish exposure from sensitivity and adaptive capacity (Turner et al. 2003; Adger 2006). Under this approach, lagged weather indicators are introduced as additional covariates around the domestic-price model:</w:t>
       </w:r>
     </w:p>
     <w:p>
@@ -4034,7 +4196,7 @@
         </m:sSub>
       </m:oMath>
       <w:r>
-        <w:t xml:space="preserve"> contains lagged standardized precipitation, solar radiation, and maximum temperature.</w:t>
+        <w:t xml:space="preserve"> contains lagged standardized precipitation, solar radiation, and maximum temperature. This reduced weather vector follows the broader local climate block used in prior cocoa water-stress modelling for San Vicente de Chucurı́ (Talero-Sarmiento et al. 2025) while remaining parsimonious enough for the short aligned sample. Precipitation and maximum temperature also map directly onto the water and heat sensitivities highlighted in the cocoa physiology literature (Lahive et al. 2019).</w:t>
       </w:r>
     </w:p>
     <w:p>
@@ -4042,7 +4204,11 @@
         <w:pStyle w:val="Textoindependiente"/>
       </w:pPr>
       <w:r>
-        <w:t>This specification is preferred at the current stage because it preserves the conceptual distinction between market transmission and local environmental stress. In substantive terms, it allows weather to enrich the interpretation of vulnerability without requiring the stronger assumption that climatic variables participate in exactly the same adjustment process as global and domestic price series.</w:t>
+        <w:t xml:space="preserve">This specification is preferred at the current stage because it preserves the conceptual distinction between market transmission and local environmental stress. In substantive terms, it allows weather to enrich the interpretation of vulnerability without requiring the </w:t>
+      </w:r>
+      <w:r>
+        <w:lastRenderedPageBreak/>
+        <w:t>stronger assumption that climatic variables participate in exactly the same adjustment process as global and domestic price series.</w:t>
       </w:r>
     </w:p>
     <w:p>
@@ -4754,8 +4920,8 @@
       <w:pPr>
         <w:pStyle w:val="Ttulo2"/>
       </w:pPr>
-      <w:bookmarkStart w:id="10" w:name="exploratory-vulnerability-indicators"/>
-      <w:bookmarkEnd w:id="9"/>
+      <w:bookmarkStart w:id="11" w:name="exploratory-vulnerability-indicators"/>
+      <w:bookmarkEnd w:id="10"/>
       <w:r>
         <w:t>Exploratory Vulnerability Indicators</w:t>
       </w:r>
@@ -5256,6 +5422,7 @@
         <w:pStyle w:val="FirstParagraph"/>
       </w:pPr>
       <w:r>
+        <w:lastRenderedPageBreak/>
         <w:t>so that positive values indicate above-average combined weather anomalies within the aligned sample.</w:t>
       </w:r>
     </w:p>
@@ -5850,8 +6017,8 @@
       <w:pPr>
         <w:pStyle w:val="Ttulo2"/>
       </w:pPr>
-      <w:bookmarkStart w:id="11" w:name="hypotheses"/>
-      <w:bookmarkEnd w:id="10"/>
+      <w:bookmarkStart w:id="12" w:name="hypotheses"/>
+      <w:bookmarkEnd w:id="11"/>
       <w:r>
         <w:t>Hypotheses</w:t>
       </w:r>
@@ -5868,36 +6035,39 @@
       <w:pPr>
         <w:pStyle w:val="Ttulo1"/>
       </w:pPr>
-      <w:bookmarkStart w:id="12" w:name="sec:results"/>
-      <w:bookmarkEnd w:id="1"/>
-      <w:bookmarkEnd w:id="11"/>
+      <w:bookmarkStart w:id="13" w:name="sec:results"/>
+      <w:bookmarkEnd w:id="2"/>
+      <w:bookmarkEnd w:id="12"/>
+      <w:r>
+        <w:t>Preliminary Results</w:t>
+      </w:r>
+    </w:p>
+    <w:p>
+      <w:pPr>
+        <w:pStyle w:val="Ttulo2"/>
+      </w:pPr>
+      <w:bookmarkStart w:id="14" w:name="descriptive-and-statistical-properties"/>
+      <w:r>
+        <w:t>Descriptive and Statistical Properties</w:t>
+      </w:r>
+    </w:p>
+    <w:p>
+      <w:pPr>
+        <w:pStyle w:val="FirstParagraph"/>
+      </w:pPr>
+      <w:r>
+        <w:t xml:space="preserve">The aligned data already show a strong contrast between the price system and the weather system. The core price levels behave mostly like non-stationary series in the shared window: ADF does not reject a unit root for Colombian cocoa, world cocoa, EU chocolate, COP/USD, or Brent, while KPSS rejects stationarity for all of them except the exchange rate. By contrast, several weather variables are more stable in levels. Precipitation, </w:t>
+      </w:r>
       <w:r>
         <w:lastRenderedPageBreak/>
-        <w:t>Preliminary Results</w:t>
-      </w:r>
-    </w:p>
-    <w:p>
-      <w:pPr>
-        <w:pStyle w:val="Ttulo2"/>
-      </w:pPr>
-      <w:bookmarkStart w:id="13" w:name="descriptive-and-statistical-properties"/>
-      <w:r>
-        <w:t>Descriptive and Statistical Properties</w:t>
-      </w:r>
-    </w:p>
-    <w:p>
-      <w:pPr>
-        <w:pStyle w:val="FirstParagraph"/>
-      </w:pPr>
-      <w:r>
-        <w:t>The aligned data already show a strong contrast between the price system and the weather system. The core price levels behave mostly like non-stationary series in the shared window: ADF does not reject a unit root for Colombian cocoa, world cocoa, EU chocolate, COP/USD, or Brent, while KPSS rejects stationarity for all of them except the exchange rate. By contrast, several weather variables are more stable in levels. Precipitation, maximum temperature, minimum temperature, humidity, wind speed, and solar radiation reject the ADF unit-root null at conventional levels in the current aligned window.</w:t>
+        <w:t>maximum temperature, minimum temperature, humidity, wind speed, and solar radiation reject the ADF unit-root null at conventional levels in the current aligned window.</w:t>
       </w:r>
     </w:p>
     <w:p>
       <w:pPr>
         <w:pStyle w:val="TableCaption"/>
       </w:pPr>
-      <w:bookmarkStart w:id="14" w:name="tab:descriptive_stats"/>
+      <w:bookmarkStart w:id="15" w:name="tab:descriptive_stats"/>
       <w:r>
         <w:t>Descriptive statistics for the core system and selected weather variables in the imputed aligned window</w:t>
       </w:r>
@@ -5907,6 +6077,7 @@
         <w:tblStyle w:val="Table"/>
         <w:tblW w:w="0" w:type="auto"/>
         <w:tblLook w:val="0020" w:firstRow="1" w:lastRow="0" w:firstColumn="0" w:lastColumn="0" w:noHBand="0" w:noVBand="0"/>
+        <w:tblCaption w:val="Descriptive statistics for the core system and selected weather variables in the imputed aligned window"/>
       </w:tblPr>
       <w:tblGrid>
         <w:gridCol w:w="2763"/>
@@ -6690,8 +6861,8 @@
       <w:pPr>
         <w:pStyle w:val="TableCaption"/>
       </w:pPr>
-      <w:bookmarkStart w:id="15" w:name="tab:stats_overview"/>
-      <w:bookmarkEnd w:id="14"/>
+      <w:bookmarkStart w:id="16" w:name="tab:stats_overview"/>
+      <w:bookmarkEnd w:id="15"/>
       <w:r>
         <w:t>Selected preliminary statistical properties from the imputed aligned panel</w:t>
       </w:r>
@@ -6701,14 +6872,15 @@
         <w:tblStyle w:val="Table"/>
         <w:tblW w:w="0" w:type="auto"/>
         <w:tblLook w:val="0020" w:firstRow="1" w:lastRow="0" w:firstColumn="0" w:lastColumn="0" w:noHBand="0" w:noVBand="0"/>
+        <w:tblCaption w:val="Selected preliminary statistical properties from the imputed aligned panel"/>
       </w:tblPr>
       <w:tblGrid>
-        <w:gridCol w:w="2550"/>
-        <w:gridCol w:w="1314"/>
-        <w:gridCol w:w="1717"/>
-        <w:gridCol w:w="1269"/>
-        <w:gridCol w:w="1397"/>
-        <w:gridCol w:w="1329"/>
+        <w:gridCol w:w="2472"/>
+        <w:gridCol w:w="1309"/>
+        <w:gridCol w:w="1691"/>
+        <w:gridCol w:w="1233"/>
+        <w:gridCol w:w="1356"/>
+        <w:gridCol w:w="1299"/>
       </w:tblGrid>
       <w:tr>
         <w:trPr>
@@ -7504,13 +7676,12 @@
         </w:tc>
       </w:tr>
     </w:tbl>
-    <w:bookmarkEnd w:id="15"/>
+    <w:bookmarkEnd w:id="16"/>
     <w:p>
       <w:pPr>
         <w:pStyle w:val="Textoindependiente"/>
       </w:pPr>
       <w:r>
-        <w:lastRenderedPageBreak/>
         <w:t>Table </w:t>
       </w:r>
       <w:hyperlink w:anchor="tab:stats_overview">
@@ -7522,35 +7693,36 @@
         </w:r>
       </w:hyperlink>
       <w:r>
-        <w:t xml:space="preserve"> highlights two features that matter for the rest of the paper. First, Colombian cocoa and world cocoa returns are both much more volatile than the downstream EU chocolate index, consistent with slower downstream adjustment. Second, weather variables are better treated as a structured environmental context than as obvious drivers of a large multivariate market system in this short sample.</w:t>
+        <w:t xml:space="preserve"> highlights two features that matter for the rest of the paper. First, Colombian cocoa and world cocoa returns are both much more volatile than the downstream EU chocolate index, which is consistent with weaker short-run downstream variation but is not sufficient on its own to identify the adjustment mechanism. Second, weather variables are better treated as a structured environmental context than as obvious drivers of a large multivariate market system in this short sample.</w:t>
       </w:r>
     </w:p>
     <w:p>
       <w:pPr>
         <w:pStyle w:val="CaptionedFigure"/>
       </w:pPr>
-      <w:bookmarkStart w:id="16" w:name="fig:indexed_core"/>
+      <w:bookmarkStart w:id="17" w:name="fig:indexed_core"/>
       <w:r>
         <w:rPr>
           <w:noProof/>
         </w:rPr>
+        <w:lastRenderedPageBreak/>
         <w:drawing>
-          <wp:inline distT="0" distB="0" distL="0" distR="0" wp14:anchorId="714D3807" wp14:editId="3A6B5336">
+          <wp:inline distT="0" distB="0" distL="0" distR="0" wp14:anchorId="069F494A" wp14:editId="27CB5102">
             <wp:extent cx="5067300" cy="2510531"/>
             <wp:effectExtent l="0" t="0" r="0" b="0"/>
-            <wp:docPr id="24" name="Picture"/>
+            <wp:docPr id="25" name="Picture"/>
             <wp:cNvGraphicFramePr/>
             <a:graphic xmlns:a="http://schemas.openxmlformats.org/drawingml/2006/main">
               <a:graphicData uri="http://schemas.openxmlformats.org/drawingml/2006/picture">
                 <pic:pic xmlns:pic="http://schemas.openxmlformats.org/drawingml/2006/picture">
                   <pic:nvPicPr>
-                    <pic:cNvPr id="25" name="Picture" descr="figures/figure_indexed_core_series_common_window_imputed.png"/>
+                    <pic:cNvPr id="26" name="Picture" descr="figures/figure_indexed_core_series_common_window_imputed.png"/>
                     <pic:cNvPicPr>
                       <a:picLocks noChangeAspect="1" noChangeArrowheads="1"/>
                     </pic:cNvPicPr>
                   </pic:nvPicPr>
                   <pic:blipFill>
-                    <a:blip r:embed="rId5"/>
+                    <a:blip r:embed="rId7"/>
                     <a:stretch>
                       <a:fillRect/>
                     </a:stretch>
@@ -7585,7 +7757,7 @@
         <w:t>Indexed core series in the imputed shared monthly window. The figure compares proportional movements across Colombian cocoa, the world cocoa benchmark, the EU chocolate index, the exchange rate, and Brent oil in the common aligned sample.</w:t>
       </w:r>
     </w:p>
-    <w:bookmarkEnd w:id="16"/>
+    <w:bookmarkEnd w:id="17"/>
     <w:p>
       <w:pPr>
         <w:pStyle w:val="Textoindependiente"/>
@@ -7609,29 +7781,29 @@
       <w:pPr>
         <w:pStyle w:val="CaptionedFigure"/>
       </w:pPr>
-      <w:bookmarkStart w:id="17" w:name="fig:core_corrplot"/>
+      <w:bookmarkStart w:id="18" w:name="fig:core_corrplot"/>
       <w:r>
         <w:rPr>
           <w:noProof/>
         </w:rPr>
         <w:lastRenderedPageBreak/>
         <w:drawing>
-          <wp:inline distT="0" distB="0" distL="0" distR="0" wp14:anchorId="42642365" wp14:editId="16AEBF4C">
+          <wp:inline distT="0" distB="0" distL="0" distR="0" wp14:anchorId="3DEF8B40" wp14:editId="29BDE1B4">
             <wp:extent cx="4800600" cy="3673788"/>
             <wp:effectExtent l="0" t="0" r="0" b="0"/>
-            <wp:docPr id="28" name="Picture"/>
+            <wp:docPr id="29" name="Picture"/>
             <wp:cNvGraphicFramePr/>
             <a:graphic xmlns:a="http://schemas.openxmlformats.org/drawingml/2006/main">
               <a:graphicData uri="http://schemas.openxmlformats.org/drawingml/2006/picture">
                 <pic:pic xmlns:pic="http://schemas.openxmlformats.org/drawingml/2006/picture">
                   <pic:nvPicPr>
-                    <pic:cNvPr id="29" name="Picture" descr="figures/figure_correlation_heatmap_levels_common_window_imputed.png"/>
+                    <pic:cNvPr id="30" name="Picture" descr="figures/figure_correlation_heatmap_levels_common_window_imputed.png"/>
                     <pic:cNvPicPr>
                       <a:picLocks noChangeAspect="1" noChangeArrowheads="1"/>
                     </pic:cNvPicPr>
                   </pic:nvPicPr>
                   <pic:blipFill>
-                    <a:blip r:embed="rId6"/>
+                    <a:blip r:embed="rId8"/>
                     <a:stretch>
                       <a:fillRect/>
                     </a:stretch>
@@ -7666,7 +7838,7 @@
         <w:t>Correlation heatmap for the imputed aligned core system. The strongest relationship is between Colombian cocoa and the world cocoa benchmark, while the exchange rate is weakly associated with the price system in levels over the shared window.</w:t>
       </w:r>
     </w:p>
-    <w:bookmarkEnd w:id="17"/>
+    <w:bookmarkEnd w:id="18"/>
     <w:p>
       <w:pPr>
         <w:pStyle w:val="Textoindependiente"/>
@@ -7701,8 +7873,8 @@
       <w:pPr>
         <w:pStyle w:val="Ttulo2"/>
       </w:pPr>
-      <w:bookmarkStart w:id="18" w:name="preliminary-core-transmission-results"/>
-      <w:bookmarkEnd w:id="13"/>
+      <w:bookmarkStart w:id="19" w:name="preliminary-core-transmission-results"/>
+      <w:bookmarkEnd w:id="14"/>
       <w:r>
         <w:t>Preliminary Core Transmission Results</w:t>
       </w:r>
@@ -7828,15 +8000,16 @@
         </m:r>
       </m:oMath>
       <w:r>
-        <w:t xml:space="preserve"> for the domestic return equation.</w:t>
+        <w:t xml:space="preserve"> for the domestic return equation. For the downstream EU series, the evidence is weaker: the level association with the world benchmark is positive, but the short-run return coefficient is small, negative, and estimated in a very low-fit equation. The downstream block therefore supports only a cautious interpretation of slower and weaker adjustment relative to the Colombian series.</w:t>
       </w:r>
     </w:p>
     <w:p>
       <w:pPr>
         <w:pStyle w:val="TableCaption"/>
       </w:pPr>
-      <w:bookmarkStart w:id="19" w:name="tab:core_results"/>
-      <w:r>
+      <w:bookmarkStart w:id="20" w:name="tab:core_results"/>
+      <w:r>
+        <w:lastRenderedPageBreak/>
         <w:t>Core transmission results from the imputed aligned sample</w:t>
       </w:r>
     </w:p>
@@ -7845,6 +8018,7 @@
         <w:tblStyle w:val="Table"/>
         <w:tblW w:w="0" w:type="auto"/>
         <w:tblLook w:val="0020" w:firstRow="1" w:lastRow="0" w:firstColumn="0" w:lastColumn="0" w:noHBand="0" w:noVBand="0"/>
+        <w:tblCaption w:val="Core transmission results from the imputed aligned sample"/>
       </w:tblPr>
       <w:tblGrid>
         <w:gridCol w:w="2668"/>
@@ -8162,7 +8336,6 @@
                   <w:rPr>
                     <w:rFonts w:ascii="Cambria Math" w:hAnsi="Cambria Math"/>
                   </w:rPr>
-                  <w:lastRenderedPageBreak/>
                   <m:t>ln(</m:t>
                 </m:r>
                 <m:sSubSup>
@@ -9329,8 +9502,8 @@
       <w:pPr>
         <w:pStyle w:val="TableCaption"/>
       </w:pPr>
-      <w:bookmarkStart w:id="20" w:name="tab:granger_pvalues"/>
-      <w:bookmarkEnd w:id="19"/>
+      <w:bookmarkStart w:id="21" w:name="tab:granger_pvalues"/>
+      <w:bookmarkEnd w:id="20"/>
       <w:r>
         <w:t xml:space="preserve">Lag-specific pairwise Granger-causality </w:t>
       </w:r>
@@ -9351,6 +9524,7 @@
         <w:tblStyle w:val="Table"/>
         <w:tblW w:w="0" w:type="auto"/>
         <w:tblLook w:val="0020" w:firstRow="1" w:lastRow="0" w:firstColumn="0" w:lastColumn="0" w:noHBand="0" w:noVBand="0"/>
+        <w:tblCaption w:val="Lag-specific pairwise Granger-causality p-values in the imputed aligned core return system"/>
       </w:tblPr>
       <w:tblGrid>
         <w:gridCol w:w="3747"/>
@@ -9980,7 +10154,7 @@
         </w:tc>
       </w:tr>
     </w:tbl>
-    <w:bookmarkEnd w:id="20"/>
+    <w:bookmarkEnd w:id="21"/>
     <w:p>
       <w:pPr>
         <w:pStyle w:val="Textoindependiente"/>
@@ -10056,29 +10230,29 @@
       <w:pPr>
         <w:pStyle w:val="CaptionedFigure"/>
       </w:pPr>
-      <w:bookmarkStart w:id="21" w:name="fig:irf"/>
+      <w:bookmarkStart w:id="22" w:name="fig:irf"/>
       <w:r>
         <w:rPr>
           <w:noProof/>
         </w:rPr>
         <w:lastRenderedPageBreak/>
         <w:drawing>
-          <wp:inline distT="0" distB="0" distL="0" distR="0" wp14:anchorId="48ED85C6" wp14:editId="5B31DB7D">
+          <wp:inline distT="0" distB="0" distL="0" distR="0" wp14:anchorId="74888CDB" wp14:editId="35909EED">
             <wp:extent cx="5334000" cy="4053898"/>
             <wp:effectExtent l="0" t="0" r="0" b="0"/>
-            <wp:docPr id="35" name="Picture"/>
+            <wp:docPr id="36" name="Picture"/>
             <wp:cNvGraphicFramePr/>
             <a:graphic xmlns:a="http://schemas.openxmlformats.org/drawingml/2006/main">
               <a:graphicData uri="http://schemas.openxmlformats.org/drawingml/2006/picture">
                 <pic:pic xmlns:pic="http://schemas.openxmlformats.org/drawingml/2006/picture">
                   <pic:nvPicPr>
-                    <pic:cNvPr id="36" name="Picture" descr="figures/figure_core_return_impulse_response.png"/>
+                    <pic:cNvPr id="37" name="Picture" descr="figures/figure_core_return_impulse_response.png"/>
                     <pic:cNvPicPr>
                       <a:picLocks noChangeAspect="1" noChangeArrowheads="1"/>
                     </pic:cNvPicPr>
                   </pic:nvPicPr>
                   <pic:blipFill>
-                    <a:blip r:embed="rId7"/>
+                    <a:blip r:embed="rId9"/>
                     <a:stretch>
                       <a:fillRect/>
                     </a:stretch>
@@ -10117,9 +10291,9 @@
       <w:pPr>
         <w:pStyle w:val="Ttulo2"/>
       </w:pPr>
-      <w:bookmarkStart w:id="22" w:name="preliminary-weather-extended-results"/>
-      <w:bookmarkEnd w:id="18"/>
-      <w:bookmarkEnd w:id="21"/>
+      <w:bookmarkStart w:id="23" w:name="preliminary-weather-extended-results"/>
+      <w:bookmarkEnd w:id="19"/>
+      <w:bookmarkEnd w:id="22"/>
       <w:r>
         <w:t>Preliminary Weather-Extended Results</w:t>
       </w:r>
@@ -10129,36 +10303,36 @@
         <w:pStyle w:val="FirstParagraph"/>
       </w:pPr>
       <w:r>
-        <w:t>The weather chapter asks a different question. It does not ask whether local weather replaces market transmission. It asks whether local weather stress helps explain how market volatility is experienced in the producing location. The selected weather variables are precipitation, solar radiation, and maximum temperature because they capture hydrological stress, seasonal radiation structure, and heat stress, respectively.</w:t>
+        <w:t>The weather chapter asks a different question. It does not ask whether local weather replaces market transmission. It asks whether local weather stress helps explain how market volatility is experienced in the producing location. The selected weather variables are precipitation, solar radiation, and maximum temperature. This choice follows the broader local cocoa weather architecture used in San Vicente de Chucurı́ (Talero-Sarmiento et al. 2025) and provides a parsimonious representation of water, radiation, and heat conditions in the aligned sample, while direct cocoa physiology support is strongest for the water- and heat-stress components (Lahive et al. 2019).</w:t>
       </w:r>
     </w:p>
     <w:p>
       <w:pPr>
         <w:pStyle w:val="CaptionedFigure"/>
       </w:pPr>
-      <w:bookmarkStart w:id="23" w:name="fig:weather_corrplot"/>
+      <w:bookmarkStart w:id="24" w:name="fig:weather_corrplot"/>
       <w:r>
         <w:rPr>
           <w:noProof/>
         </w:rPr>
         <w:lastRenderedPageBreak/>
         <w:drawing>
-          <wp:inline distT="0" distB="0" distL="0" distR="0" wp14:anchorId="22BE2D18" wp14:editId="74D4ADA9">
+          <wp:inline distT="0" distB="0" distL="0" distR="0" wp14:anchorId="082DBD32" wp14:editId="5DBFEB7F">
             <wp:extent cx="5334000" cy="4083066"/>
             <wp:effectExtent l="0" t="0" r="0" b="0"/>
-            <wp:docPr id="40" name="Picture"/>
+            <wp:docPr id="41" name="Picture"/>
             <wp:cNvGraphicFramePr/>
             <a:graphic xmlns:a="http://schemas.openxmlformats.org/drawingml/2006/main">
               <a:graphicData uri="http://schemas.openxmlformats.org/drawingml/2006/picture">
                 <pic:pic xmlns:pic="http://schemas.openxmlformats.org/drawingml/2006/picture">
                   <pic:nvPicPr>
-                    <pic:cNvPr id="41" name="Picture" descr="figures/figure_climate_core_correlation_common_sample.png"/>
+                    <pic:cNvPr id="42" name="Picture" descr="figures/figure_climate_core_correlation_common_sample.png"/>
                     <pic:cNvPicPr>
                       <a:picLocks noChangeAspect="1" noChangeArrowheads="1"/>
                     </pic:cNvPicPr>
                   </pic:nvPicPr>
                   <pic:blipFill>
-                    <a:blip r:embed="rId8"/>
+                    <a:blip r:embed="rId10"/>
                     <a:stretch>
                       <a:fillRect/>
                     </a:stretch>
@@ -10193,7 +10367,7 @@
         <w:t>Climate-core correlation matrix in the aligned common sample. This figure plays a parallel role to the impulse-response matrix for the core transmission block: it summarizes how the selected weather variables and the broader climate block relate to the price system without forcing an unstable weather-augmented VAR in a 51-observation complete sample.</w:t>
       </w:r>
     </w:p>
-    <w:bookmarkEnd w:id="23"/>
+    <w:bookmarkEnd w:id="24"/>
     <w:p>
       <w:pPr>
         <w:pStyle w:val="Textoindependiente"/>
@@ -10217,29 +10391,29 @@
       <w:pPr>
         <w:pStyle w:val="CaptionedFigure"/>
       </w:pPr>
-      <w:bookmarkStart w:id="24" w:name="fig:climate_panels"/>
+      <w:bookmarkStart w:id="25" w:name="fig:climate_panels"/>
       <w:r>
         <w:rPr>
           <w:noProof/>
         </w:rPr>
         <w:lastRenderedPageBreak/>
         <w:drawing>
-          <wp:inline distT="0" distB="0" distL="0" distR="0" wp14:anchorId="1E171239" wp14:editId="7622E8D9">
+          <wp:inline distT="0" distB="0" distL="0" distR="0" wp14:anchorId="26BA5A27" wp14:editId="56215D0A">
             <wp:extent cx="5334000" cy="8655763"/>
             <wp:effectExtent l="0" t="0" r="0" b="0"/>
-            <wp:docPr id="44" name="Picture"/>
+            <wp:docPr id="45" name="Picture"/>
             <wp:cNvGraphicFramePr/>
             <a:graphic xmlns:a="http://schemas.openxmlformats.org/drawingml/2006/main">
               <a:graphicData uri="http://schemas.openxmlformats.org/drawingml/2006/picture">
                 <pic:pic xmlns:pic="http://schemas.openxmlformats.org/drawingml/2006/picture">
                   <pic:nvPicPr>
-                    <pic:cNvPr id="45" name="Picture" descr="figures/figure_climate_series_panels_common_window.png"/>
+                    <pic:cNvPr id="46" name="Picture" descr="figures/figure_climate_series_panels_common_window.png"/>
                     <pic:cNvPicPr>
                       <a:picLocks noChangeAspect="1" noChangeArrowheads="1"/>
                     </pic:cNvPicPr>
                   </pic:nvPicPr>
                   <pic:blipFill>
-                    <a:blip r:embed="rId9"/>
+                    <a:blip r:embed="rId11"/>
                     <a:stretch>
                       <a:fillRect/>
                     </a:stretch>
@@ -10279,8 +10453,8 @@
       <w:pPr>
         <w:pStyle w:val="TableCaption"/>
       </w:pPr>
-      <w:bookmarkStart w:id="25" w:name="tab:weather_results"/>
-      <w:bookmarkEnd w:id="24"/>
+      <w:bookmarkStart w:id="26" w:name="tab:weather_results"/>
+      <w:bookmarkEnd w:id="25"/>
       <w:r>
         <w:t>Weather-extended domestic models from the imputed aligned sample</w:t>
       </w:r>
@@ -10290,13 +10464,14 @@
         <w:tblStyle w:val="Table"/>
         <w:tblW w:w="0" w:type="auto"/>
         <w:tblLook w:val="0020" w:firstRow="1" w:lastRow="0" w:firstColumn="0" w:lastColumn="0" w:noHBand="0" w:noVBand="0"/>
+        <w:tblCaption w:val="Weather-extended domestic models from the imputed aligned sample"/>
       </w:tblPr>
       <w:tblGrid>
-        <w:gridCol w:w="5088"/>
+        <w:gridCol w:w="4901"/>
         <w:gridCol w:w="1363"/>
-        <w:gridCol w:w="1155"/>
+        <w:gridCol w:w="1134"/>
         <w:gridCol w:w="1044"/>
-        <w:gridCol w:w="926"/>
+        <w:gridCol w:w="918"/>
       </w:tblGrid>
       <w:tr>
         <w:trPr>
@@ -12034,7 +12209,7 @@
         </w:tc>
       </w:tr>
     </w:tbl>
-    <w:bookmarkEnd w:id="25"/>
+    <w:bookmarkEnd w:id="26"/>
     <w:p>
       <w:pPr>
         <w:pStyle w:val="Textoindependiente"/>
@@ -12070,14 +12245,14 @@
         </m:sSup>
       </m:oMath>
       <w:r>
-        <w:t xml:space="preserve"> only modestly relative to the core domestic models. The improvement is 0.0017 in levels and 0.0139 in returns. This is substantively useful because it suggests that weather matters more for vulnerability framing than for replacing the benchmark market variables in the core transmission mechanism.</w:t>
+        <w:t xml:space="preserve"> only modestly relative to the core domestic models. The improvement is 0.0017 in levels and 0.0139 in returns, and most individual weather coefficients are not conventionally significant. This is still interpretively useful because it suggests that weather matters more for vulnerability framing than for replacing the benchmark market variables in the core transmission mechanism.</w:t>
       </w:r>
     </w:p>
     <w:p>
       <w:pPr>
         <w:pStyle w:val="TableCaption"/>
       </w:pPr>
-      <w:bookmarkStart w:id="26" w:name="tab:vulnerability_definitions"/>
+      <w:bookmarkStart w:id="27" w:name="tab:vulnerability_definitions"/>
       <w:r>
         <w:t>Definition and empirical range of the exploratory vulnerability indicators</w:t>
       </w:r>
@@ -12087,12 +12262,13 @@
         <w:tblStyle w:val="Table"/>
         <w:tblW w:w="0" w:type="auto"/>
         <w:tblLook w:val="0020" w:firstRow="1" w:lastRow="0" w:firstColumn="0" w:lastColumn="0" w:noHBand="0" w:noVBand="0"/>
+        <w:tblCaption w:val="Definition and empirical range of the exploratory vulnerability indicators"/>
       </w:tblPr>
       <w:tblGrid>
-        <w:gridCol w:w="1774"/>
-        <w:gridCol w:w="6098"/>
+        <w:gridCol w:w="1748"/>
+        <w:gridCol w:w="5914"/>
         <w:gridCol w:w="798"/>
-        <w:gridCol w:w="906"/>
+        <w:gridCol w:w="900"/>
       </w:tblGrid>
       <w:tr>
         <w:trPr>
@@ -12629,30 +12805,30 @@
       <w:pPr>
         <w:pStyle w:val="CaptionedFigure"/>
       </w:pPr>
-      <w:bookmarkStart w:id="27" w:name="fig:vulnerability"/>
-      <w:bookmarkEnd w:id="26"/>
+      <w:bookmarkStart w:id="28" w:name="fig:vulnerability"/>
+      <w:bookmarkEnd w:id="27"/>
       <w:r>
         <w:rPr>
           <w:noProof/>
         </w:rPr>
         <w:lastRenderedPageBreak/>
         <w:drawing>
-          <wp:inline distT="0" distB="0" distL="0" distR="0" wp14:anchorId="344BCC5C" wp14:editId="5AEBC541">
+          <wp:inline distT="0" distB="0" distL="0" distR="0" wp14:anchorId="58FB1E6D" wp14:editId="34CB149D">
             <wp:extent cx="4960620" cy="2459340"/>
             <wp:effectExtent l="0" t="0" r="0" b="0"/>
-            <wp:docPr id="50" name="Picture"/>
+            <wp:docPr id="51" name="Picture"/>
             <wp:cNvGraphicFramePr/>
             <a:graphic xmlns:a="http://schemas.openxmlformats.org/drawingml/2006/main">
               <a:graphicData uri="http://schemas.openxmlformats.org/drawingml/2006/picture">
                 <pic:pic xmlns:pic="http://schemas.openxmlformats.org/drawingml/2006/picture">
                   <pic:nvPicPr>
-                    <pic:cNvPr id="51" name="Picture" descr="figures/figure_weather_vulnerability_index.png"/>
+                    <pic:cNvPr id="52" name="Picture" descr="figures/figure_weather_vulnerability_index.png"/>
                     <pic:cNvPicPr>
                       <a:picLocks noChangeAspect="1" noChangeArrowheads="1"/>
                     </pic:cNvPicPr>
                   </pic:nvPicPr>
                   <pic:blipFill>
-                    <a:blip r:embed="rId10"/>
+                    <a:blip r:embed="rId12"/>
                     <a:stretch>
                       <a:fillRect/>
                     </a:stretch>
@@ -12698,7 +12874,7 @@
         <w:t>-score) standardizes the average absolute anomaly across precipitation, solar radiation, and maximum temperature; the farmer exposure index adds domestic volatility and fitted market-transmission shock; the livelihood-risk score additionally incorporates world-cocoa volatility.</w:t>
       </w:r>
     </w:p>
-    <w:bookmarkEnd w:id="27"/>
+    <w:bookmarkEnd w:id="28"/>
     <w:p>
       <w:pPr>
         <w:pStyle w:val="Textoindependiente"/>
@@ -12726,17 +12902,17 @@
         </w:r>
       </w:hyperlink>
       <w:r>
-        <w:t xml:space="preserve"> clarify the meaning of the exploratory indicators. Weather stress is not a raw climate level; it is a relative anomaly score within the aligned sample. The farmer exposure index should therefore be read as a standardized combination of domestic volatility, predicted market-shock magnitude, and local weather anomaly. The livelihood-risk score adds world-cocoa volatility in order to represent an external market-pressure layer on top of local exposure. The highest-risk months under this exploratory scoring are May 2024, April 2024, November 2024, December 2024, and October 2025. These dates should be interpreted carefully, but they are consistent with the broader idea that vulnerability in this system is produced by the interaction of transmitted market shocks and local stress conditions, not by weather alone.</w:t>
+        <w:t xml:space="preserve"> clarify the meaning of the exploratory indicators. Weather stress is not a raw climate level; it is a relative anomaly score within the aligned sample. The farmer exposure index should therefore be read as a standardized combination of domestic volatility, predicted market-shock magnitude, and local weather anomaly. The livelihood-risk score adds world-cocoa volatility in order to represent an external market-pressure layer on top of local exposure. The highest-risk months under this exploratory scoring are May 2024, April 2024, November 2024, December 2024, and October 2025. These dates should be interpreted as descriptive outputs of the exploratory index rather than as validated welfare rankings, but they remain consistent with the broader idea that vulnerability in this system is produced by the interaction of transmitted market shocks and local stress conditions, not by weather alone.</w:t>
       </w:r>
     </w:p>
     <w:p>
       <w:pPr>
         <w:pStyle w:val="Ttulo2"/>
       </w:pPr>
-      <w:bookmarkStart w:id="28" w:name="preliminary-answers-to-the-hypotheses"/>
-      <w:bookmarkEnd w:id="22"/>
-      <w:r>
-        <w:t>Preliminary Answers to the Hypotheses</w:t>
+      <w:bookmarkStart w:id="29" w:name="Xa40d41962931f19f044c97ae86250d7c7895a87"/>
+      <w:bookmarkEnd w:id="23"/>
+      <w:r>
+        <w:t>Preliminary Answers to the Gap Questions and Hypotheses</w:t>
       </w:r>
     </w:p>
     <w:p>
@@ -12748,7 +12924,7 @@
           <w:b/>
           <w:bCs/>
         </w:rPr>
-        <w:t>H1 is supported.</w:t>
+        <w:t>Gap question 1 / H1 is supported.</w:t>
       </w:r>
       <w:r>
         <w:t xml:space="preserve"> The clearest result in the draft is the positive and statistically strong effect of world cocoa returns on Colombian cocoa returns.</w:t>
@@ -12763,7 +12939,7 @@
           <w:b/>
           <w:bCs/>
         </w:rPr>
-        <w:t>H2 is partially supported.</w:t>
+        <w:t>Gap questions 1–2 / H2 is partially supported.</w:t>
       </w:r>
       <w:r>
         <w:t xml:space="preserve"> The EU downstream series moves with the system in levels, but the short-run return response is much weaker and the EU return model has poor fit.</w:t>
@@ -12778,7 +12954,7 @@
           <w:b/>
           <w:bCs/>
         </w:rPr>
-        <w:t>H3 is partially supported.</w:t>
+        <w:t>Gap question 3 / H3 is partially supported.</w:t>
       </w:r>
       <w:r>
         <w:t xml:space="preserve"> Weather variables do not dominate the market system, but they do improve the vulnerability narrative and contribute modestly to model fit, especially through solar radiation in levels and heat stress in lagged returns.</w:t>
@@ -12793,25 +12969,22 @@
           <w:b/>
           <w:bCs/>
         </w:rPr>
-        <w:t>H4 is provisionally supported.</w:t>
-      </w:r>
-      <w:r>
-        <w:t xml:space="preserve"> The climate-augmented system remains theoretically attractive but empirically fragile under the current 51-observation complete weather overlap. For now, the manuscript should emphasize weather as contextual vulnerability </w:t>
-      </w:r>
-      <w:r>
         <w:lastRenderedPageBreak/>
-        <w:t>information and present climate-augmented cointegration as an exploratory extension rather than as the main result.</w:t>
+        <w:t>Gap question 3 / H4 is provisionally supported.</w:t>
+      </w:r>
+      <w:r>
+        <w:t xml:space="preserve"> The climate-augmented system remains theoretically attractive but empirically fragile under the current 51-observation complete weather overlap. For now, the manuscript should emphasize weather as contextual vulnerability information and present climate-augmented cointegration as an exploratory extension rather than as the main result.</w:t>
       </w:r>
     </w:p>
     <w:p>
       <w:pPr>
         <w:pStyle w:val="Ttulo1"/>
       </w:pPr>
-      <w:bookmarkStart w:id="29" w:name="sec:discussion"/>
-      <w:bookmarkEnd w:id="12"/>
-      <w:bookmarkEnd w:id="28"/>
-      <w:r>
-        <w:t>Discussion and Limitations</w:t>
+      <w:bookmarkStart w:id="30" w:name="sec:discussion"/>
+      <w:bookmarkEnd w:id="13"/>
+      <w:bookmarkEnd w:id="29"/>
+      <w:r>
+        <w:t>Discussion</w:t>
       </w:r>
     </w:p>
     <w:p>
@@ -12819,7 +12992,7 @@
         <w:pStyle w:val="FirstParagraph"/>
       </w:pPr>
       <w:r>
-        <w:t>The main limitation is sample length. The core aligned monthly window contains only 53 months, and the fully complete climate-augmented overlap contains only 51 months. This is enough for transparent descriptive work and cautious reduced-form analysis, but it is short for strong multivariate cointegration claims in a system that mixes domestic, benchmark, downstream, macro, and climate variables (Hakkio and Rush 1991). That is why the draft distinguishes so carefully between the core transmission chapter and the weather-augmented extension.</w:t>
+        <w:t>The manuscript set out to address a specific gap in the cocoa literature: the lack of empirical designs that trace how benchmark commodity shocks reach producers while also situating those shocks within a local environmental context. The strongest result is that international cocoa movements remain the dominant short-run driver of Colombian cocoa price changes in the aligned window. This matters because cocoa studies already show that producer livelihoods are exposed to price volatility, weak farmer organizations, dependence on few buyers, and climate-related production risks (Mithofer et al. 2017; Akrofi-Atitianti et al. 2018). The present results complement that literature by identifying one concrete exposure channel through which global instability becomes locally relevant for producers. In that sense, resilience in a cocoa-producing territory cannot be understood only through agronomy or governance indicators if the mechanism of market exposure remains unmeasured.</w:t>
       </w:r>
     </w:p>
     <w:p>
@@ -12827,7 +13000,7 @@
         <w:pStyle w:val="Textoindependiente"/>
       </w:pPr>
       <w:r>
-        <w:t>A second limitation is the structure of the missing-data problem. Although only two cells needed imputation, any imputed value is still an estimate rather than a recovered observation. The manuscript therefore treats imputation as a continuity device and a sensitivity tool, not as a solution to fundamental data scarcity. The non-imputed balanced sample should remain the main reference for aligned descriptive reporting, while imputed variants are best understood as supportive continuity artifacts.</w:t>
+        <w:t>The second gap question concerned differential adjustment across the supply chain. Here the results are informative, but more qualified than in the domestic transmission block. Colombian producer-linked prices move closely with the world benchmark, whereas the EU chocolate index shows a positive level association but a much weaker and less stable short-run response. Taken together with the lower downstream volatility, this pattern is consistent with a cocoa-chain interpretation in which exposure is unevenly distributed across actors, but it should not be read as definitive proof of downstream buffering in a structural sense. Earlier cocoa studies similarly show that integration into world markets can increase farmer exposure without proportionate gains to farmers, while producer concerns remain shaped by weak organizations and dependence on limited market channels (Tsowou and Gayi 2019; Mithofer et al. 2017). Comparative work on coffee value chains points in the same general direction for tropical tree crops cultivated under similar conditions, emphasizing that adaptive capacity depends on support and coordination across the chain (Morales et al. 2022; Verburg et al. 2019). The manuscript cannot identify the exact institutional mechanism behind differential adjustment, but the results remain consistent with the idea that value-chain position matters for how shocks are absorbed or passed on.</w:t>
       </w:r>
     </w:p>
     <w:p>
@@ -12835,7 +13008,11 @@
         <w:pStyle w:val="Textoindependiente"/>
       </w:pPr>
       <w:r>
-        <w:t>A third limitation is measurement. The Colombian domestic series is a national weekly reference series aggregated to monthly means, not a farm-gate micro panel. The EU downstream series is a consumer-price index, not a wholesale chocolate margin. The weather block is a location-level NASA POWER climate panel, not a farm-observed yield or disease dataset. These features do not invalidate the analysis, but they shape the type of claim the paper can make. The paper is strongest when it speaks about transmission, volatility, and vulnerability context across linked market layers rather than about farm-level agronomic causality.</w:t>
+        <w:t xml:space="preserve">The third gap question concerned the role of local weather stress. The weather block does not overturn the market results, and that negative finding is informative. Rather than showing that climate variables dominate short-run price formation, the estimates support a narrower and more defensible interpretation: local weather conditions help identify when transmitted market shocks are experienced under tighter environmental stress. This </w:t>
+      </w:r>
+      <w:r>
+        <w:lastRenderedPageBreak/>
+        <w:t>interpretation is strengthened more by the conceptual role of the weather block and the exploratory index construction than by strong standalone weather coefficients in the regressions. It is consistent with cocoa studies showing that vulnerability depends on climatic suitability, physiological sensitivity, farm management, and ecological design (Schroth et al. 2016; Lahive et al. 2019). It is also consistent with evidence that agroforestry and diversified systems can improve buffering capacity, income diversification, and adaptation potential under cocoa climate stress (Jacobi et al. 2013; Niether et al. 2020; Vaast and Somarriba 2014). Comparable climate-risk work on coffee likewise suggests that adaptation support in perennial tropical cash crops has to be targeted to the regions and systems facing the highest environmental stress (Koh et al. 2020; Laderach et al. 2016). For that reason, the exploratory vulnerability indicators proposed here should be read as transparent organizing devices rather than as validated welfare measures.</w:t>
       </w:r>
     </w:p>
     <w:p>
@@ -12843,7 +13020,7 @@
         <w:pStyle w:val="Textoindependiente"/>
       </w:pPr>
       <w:r>
-        <w:t>The current draft also inherits institutional source transitions. The Eurostat downstream endpoint used here is the legacy COICOP series running through December 2025, after which the classification changes. The Brent monthly series required a March 2026 extension derived from the official daily history because the official monthly page stopped at February 2026 at the time of download. These transitions are documented rather than hidden, but they still matter for replication and future updates.</w:t>
+        <w:t>These contributions should be interpreted alongside several limitations. The main limitation is sample length. The core aligned monthly window contains only 53 months, and the fully complete climate-augmented overlap contains only 51 months. This is sufficient for transparent descriptive work and cautious reduced-form analysis, but it is short for strong multivariate cointegration claims in a system that mixes domestic, benchmark, downstream, macro, and climate variables (Hakkio and Rush 1991). A second limitation is the structure of the missing-data problem. Although only two cells required imputation, any imputed value remains an estimate rather than a recovered observation. The manuscript therefore treats imputation as a continuity device and a sensitivity tool, not as a remedy for fundamental data scarcity.</w:t>
       </w:r>
     </w:p>
     <w:p>
@@ -12851,17 +13028,28 @@
         <w:pStyle w:val="Textoindependiente"/>
       </w:pPr>
       <w:r>
-        <w:t>Finally, the paper should resist over-claiming from the weather chapter. The current evidence does not show that local weather overwhelms international market transmission. Instead, it shows that vulnerability is best read as the interaction of a volatile market chain and a structured environmental setting. That distinction is important both methodologically and substantively.</w:t>
+        <w:t>Measurement also constrains the scope of inference. The Colombian domestic series is a national weekly reference price aggregated to monthly means, not a farm-gate micro panel; the EU downstream series is a consumer-price index rather than a wholesale chocolate margin; and the weather block is a location-level NASA POWER panel rather than a farm-observed yield or disease dataset. These features do not invalidate the analysis, but they mean that the paper is strongest when it speaks about transmission, volatility, and vulnerability context across linked market layers rather than about farm-level agronomic causality. The manuscript also inherits institutional source transitions, particularly the legacy Eurostat COICOP endpoint through December 2025 and the March 2026 Brent extension derived from official daily data. These issues are documented for replication, but they still matter for future updating.</w:t>
+      </w:r>
+    </w:p>
+    <w:p>
+      <w:pPr>
+        <w:pStyle w:val="Textoindependiente"/>
+      </w:pPr>
+      <w:r>
+        <w:t xml:space="preserve">Even with those constraints, the paper contributes to both theory and policy. Conceptually, it argues for treating resilience in commodity systems as an interaction between transmitted market instability and local adaptive context rather than as a purely ecological, institutional, or behavioral attribute in isolation, consistent with vulnerability and food-system resilience frameworks (Turner et al. 2003; Adger 2006; Zurek et al. 2022). Empirically, it shows that a transparent transmission design can make that interaction visible even before household microdata are available. For policy, the implication is that producer resilience cannot be assessed through climate adaptation measures alone. The current evidence most strongly supports benchmark pass-through, the broader </w:t>
+      </w:r>
+      <w:r>
+        <w:lastRenderedPageBreak/>
+        <w:t>macroeconomic environment in which transmission occurs, differences in adjustment across market layers, and locally weather-sensitive support systems as parts of the same diagnostic frame (Gereffi et al. 2005; Merkle et al. 2021).</w:t>
       </w:r>
     </w:p>
     <w:p>
       <w:pPr>
         <w:pStyle w:val="Ttulo1"/>
       </w:pPr>
-      <w:bookmarkStart w:id="30" w:name="conclusion"/>
-      <w:bookmarkEnd w:id="29"/>
-      <w:r>
-        <w:lastRenderedPageBreak/>
+      <w:bookmarkStart w:id="31" w:name="conclusion"/>
+      <w:bookmarkEnd w:id="30"/>
+      <w:r>
         <w:t>Conclusion</w:t>
       </w:r>
     </w:p>
@@ -12870,7 +13058,7 @@
         <w:pStyle w:val="FirstParagraph"/>
       </w:pPr>
       <w:r>
-        <w:t>This paper develops a transparent empirical framework to study cocoa price volatility and smallholder vulnerability across the supply chain. Rather than focusing solely on econometric results, the contribution lies in integrating a clearly documented data architecture with a coherent empirical strategy linking Colombian domestic prices, international cocoa benchmarks, European downstream prices, macroeconomic controls, and local weather conditions.</w:t>
+        <w:t>This paper develops a transparent empirical framework to study cocoa price volatility and smallholder vulnerability across the supply chain. Its main contribution is to bring three questions into one design: how international cocoa shocks are transmitted to Colombian producer-linked prices once exchange-rate and oil conditions are considered, whether adjustment is distributed unevenly between producer-linked and downstream prices, and whether local weather should be interpreted as a contextual stressor rather than as the dominant short-run price driver.</w:t>
       </w:r>
     </w:p>
     <w:p>
@@ -12878,7 +13066,7 @@
         <w:pStyle w:val="Textoindependiente"/>
       </w:pPr>
       <w:r>
-        <w:t>The preliminary evidence points to three main findings. First, short-run price transmission from international cocoa markets to Colombian domestic prices is strong and statistically robust, indicating that local producer prices are closely tied to global market dynamics. Second, downstream European chocolate prices adjust more slowly and more weakly, suggesting incomplete and lagged transmission along the supply chain. Third, the inclusion of weather variables does not materially alter the core transmission results, but provides additional context for interpreting periods of heightened vulnerability, particularly when local environmental stress coincides with market volatility.</w:t>
+        <w:t>The preliminary evidence points to three aligned conclusions. First, transmission from international cocoa markets to Colombian domestic prices is strong and statistically robust, indicating that producer exposure is closely tied to benchmark movements within a broader macroeconomic environment. Second, the European downstream chocolate index shows weaker and less stable short-run adjustment, which is consistent with, but does not by itself prove, uneven distribution of adjustment across actors in the supply chain. Third, the weather variables do not overturn the core transmission results, and their main value in the current draft is to identify the local stress context in which market-driven exposure is experienced.</w:t>
       </w:r>
     </w:p>
     <w:p>
@@ -12886,23 +13074,76 @@
         <w:pStyle w:val="Textoindependiente"/>
       </w:pPr>
       <w:r>
-        <w:t>Taken together, these results suggest that smallholder exposure is driven primarily by global price movements and their rapid transmission into domestic markets, while downstream price dynamics and local climatic conditions play a secondary but complementary role. In this sense, vulnerability emerges not only from price levels but from the interaction between volatility, transmission intensity, and local stress conditions.</w:t>
-      </w:r>
-    </w:p>
-    <w:p>
-      <w:pPr>
-        <w:pStyle w:val="Bibliografa"/>
+        <w:t>Taken together, these results suggest that vulnerability in the cocoa chain is shaped by transmitted market instability, the macroeconomic setting of transmission, differences in adjustment across market layers, and local stress conditions. The paper therefore contributes to resilience research by showing that market transmission itself is part of the exposure mechanism that vulnerability analysis must explain (Turner et al. 2003; Adger 2006). For policy, the implication is that producer resilience cannot be strengthened through climate adaptation measures alone; it also requires attention to benchmark pass-through and to the institutional conditions that determine how shocks are absorbed or passed along the chain (Gereffi et al. 2005; Merkle et al. 2021).</w:t>
+      </w:r>
+    </w:p>
+    <w:p>
+      <w:r>
+        <w:br w:type="page"/>
+      </w:r>
+    </w:p>
+    <w:p>
+      <w:pPr>
+        <w:pStyle w:val="Ttulo1"/>
         <w:rPr>
           <w:lang w:val="es-ES"/>
         </w:rPr>
       </w:pPr>
-      <w:bookmarkStart w:id="31" w:name="ref-acosta_ihle_voncramon_2019"/>
-      <w:bookmarkStart w:id="32" w:name="refs"/>
+      <w:proofErr w:type="spellStart"/>
       <w:r>
         <w:rPr>
           <w:lang w:val="es-ES"/>
         </w:rPr>
-        <w:t xml:space="preserve">Acosta, Alejandro, Rico Ihle, and Stephan von Cramon-Taubadel. </w:t>
+        <w:lastRenderedPageBreak/>
+        <w:t>R</w:t>
+      </w:r>
+      <w:r>
+        <w:rPr>
+          <w:lang w:val="es-ES"/>
+        </w:rPr>
+        <w:t>eferences</w:t>
+      </w:r>
+      <w:proofErr w:type="spellEnd"/>
+    </w:p>
+    <w:p>
+      <w:pPr>
+        <w:pStyle w:val="Bibliografa"/>
+      </w:pPr>
+      <w:bookmarkStart w:id="32" w:name="ref-acosta_ihle_voncramon_2019"/>
+      <w:bookmarkStart w:id="33" w:name="refs"/>
+      <w:r>
+        <w:rPr>
+          <w:lang w:val="es-ES"/>
+        </w:rPr>
+        <w:t xml:space="preserve">Acosta, Alejandro, Rico Ihle, and Stephan </w:t>
+      </w:r>
+      <w:proofErr w:type="spellStart"/>
+      <w:r>
+        <w:rPr>
+          <w:lang w:val="es-ES"/>
+        </w:rPr>
+        <w:t>von</w:t>
+      </w:r>
+      <w:proofErr w:type="spellEnd"/>
+      <w:r>
+        <w:rPr>
+          <w:lang w:val="es-ES"/>
+        </w:rPr>
+        <w:t xml:space="preserve"> Cramon-</w:t>
+      </w:r>
+      <w:proofErr w:type="spellStart"/>
+      <w:r>
+        <w:rPr>
+          <w:lang w:val="es-ES"/>
+        </w:rPr>
+        <w:t>Taubadel</w:t>
+      </w:r>
+      <w:proofErr w:type="spellEnd"/>
+      <w:r>
+        <w:rPr>
+          <w:lang w:val="es-ES"/>
+        </w:rPr>
+        <w:t xml:space="preserve">. </w:t>
       </w:r>
       <w:r>
         <w:t xml:space="preserve">2019. “Combining Market Structure and Econometric Methods for Price Transmission Analysis.” </w:t>
@@ -12911,29 +13152,21 @@
         <w:rPr>
           <w:i/>
           <w:iCs/>
-          <w:lang w:val="es-ES"/>
         </w:rPr>
         <w:t>Food Security</w:t>
       </w:r>
       <w:r>
-        <w:rPr>
-          <w:lang w:val="es-ES"/>
-        </w:rPr>
         <w:t xml:space="preserve"> 11 (4): 941–51. </w:t>
       </w:r>
-      <w:hyperlink r:id="rId11">
+      <w:hyperlink r:id="rId13">
         <w:r>
           <w:rPr>
             <w:rStyle w:val="Hipervnculo"/>
-            <w:lang w:val="es-ES"/>
           </w:rPr>
           <w:t>https://doi.org/10.1007/s12571-019-00951-w</w:t>
         </w:r>
       </w:hyperlink>
       <w:r>
-        <w:rPr>
-          <w:lang w:val="es-ES"/>
-        </w:rPr>
         <w:t>.</w:t>
       </w:r>
     </w:p>
@@ -12941,34 +13174,27 @@
       <w:pPr>
         <w:pStyle w:val="Bibliografa"/>
       </w:pPr>
-      <w:bookmarkStart w:id="33" w:name="ref-banrep_trm"/>
-      <w:bookmarkEnd w:id="31"/>
-      <w:r>
-        <w:rPr>
-          <w:lang w:val="es-ES"/>
-        </w:rPr>
-        <w:t xml:space="preserve">Banco de la Republica. 2026. </w:t>
+      <w:bookmarkStart w:id="34" w:name="ref-Adger2006"/>
+      <w:bookmarkEnd w:id="32"/>
+      <w:r>
+        <w:t xml:space="preserve">Adger, W. Neil. 2006. “Vulnerability.” </w:t>
       </w:r>
       <w:r>
         <w:rPr>
           <w:i/>
           <w:iCs/>
-          <w:lang w:val="es-ES"/>
         </w:rPr>
-        <w:t>Tasa de Cambio Representativa Del Mercado (TRM)</w:t>
-      </w:r>
-      <w:r>
-        <w:rPr>
-          <w:lang w:val="es-ES"/>
-        </w:rPr>
-        <w:t xml:space="preserve">. </w:t>
-      </w:r>
-      <w:hyperlink r:id="rId12">
+        <w:t>Global Environmental Change</w:t>
+      </w:r>
+      <w:r>
+        <w:t xml:space="preserve"> 16 (3): 268–81. </w:t>
+      </w:r>
+      <w:hyperlink r:id="rId14">
         <w:r>
           <w:rPr>
             <w:rStyle w:val="Hipervnculo"/>
           </w:rPr>
-          <w:t>Https://www.banrep.gov.co/es/glosario/tasa-cambio-trm</w:t>
+          <w:t>https://doi.org/10.1016/j.gloenvcha.2006.02.006</w:t>
         </w:r>
       </w:hyperlink>
       <w:r>
@@ -12979,8 +13205,39 @@
       <w:pPr>
         <w:pStyle w:val="Bibliografa"/>
       </w:pPr>
-      <w:bookmarkStart w:id="34" w:name="ref-vanbuuren_groothuisoudshoorn_2011"/>
-      <w:bookmarkEnd w:id="33"/>
+      <w:bookmarkStart w:id="35" w:name="ref-AkrofiAtitianti2018"/>
+      <w:bookmarkEnd w:id="34"/>
+      <w:r>
+        <w:t xml:space="preserve">Akrofi-Atitianti, Felix, Chinwe Ifejika Speranza, Louis Bockel, and Richard Asare. 2018. “Assessing Climate Smart Agriculture and Its Determinants of Practice in Ghana: A Case of the Cocoa Production System.” </w:t>
+      </w:r>
+      <w:r>
+        <w:rPr>
+          <w:i/>
+          <w:iCs/>
+        </w:rPr>
+        <w:t>Land</w:t>
+      </w:r>
+      <w:r>
+        <w:t xml:space="preserve"> 7 (1): 30. </w:t>
+      </w:r>
+      <w:hyperlink r:id="rId15">
+        <w:r>
+          <w:rPr>
+            <w:rStyle w:val="Hipervnculo"/>
+          </w:rPr>
+          <w:t>https://doi.org/10.3390/land7010030</w:t>
+        </w:r>
+      </w:hyperlink>
+      <w:r>
+        <w:t>.</w:t>
+      </w:r>
+    </w:p>
+    <w:p>
+      <w:pPr>
+        <w:pStyle w:val="Bibliografa"/>
+      </w:pPr>
+      <w:bookmarkStart w:id="36" w:name="ref-vanbuuren_groothuisoudshoorn_2011"/>
+      <w:bookmarkEnd w:id="35"/>
       <w:r>
         <w:t xml:space="preserve">Buuren, Stef van, and Karin Groothuis-Oudshoorn. 2011. “mice: Multivariate Imputation by Chained Equations in R.” </w:t>
       </w:r>
@@ -12994,7 +13251,7 @@
       <w:r>
         <w:t xml:space="preserve"> 45 (3): 1–67. </w:t>
       </w:r>
-      <w:hyperlink r:id="rId13">
+      <w:hyperlink r:id="rId16">
         <w:r>
           <w:rPr>
             <w:rStyle w:val="Hipervnculo"/>
@@ -13010,47 +13267,58 @@
       <w:pPr>
         <w:pStyle w:val="Bibliografa"/>
       </w:pPr>
-      <w:bookmarkStart w:id="35" w:name="ref-engle_granger_1987"/>
-      <w:bookmarkEnd w:id="34"/>
-      <w:r>
-        <w:t xml:space="preserve">Engle, Robert F., and Clive W. J. Granger. 1987. “Co-Integration and Error Correction: Representation, Estimation, and Testing.” </w:t>
+      <w:bookmarkStart w:id="37" w:name="ref-Ericksen2008"/>
+      <w:bookmarkEnd w:id="36"/>
+      <w:r>
+        <w:t xml:space="preserve">Ericksen, Polly J. 2008. “Conceptualizing Food Systems for Global Environmental Change Research.” </w:t>
       </w:r>
       <w:r>
         <w:rPr>
           <w:i/>
           <w:iCs/>
         </w:rPr>
-        <w:t>Econometrica</w:t>
-      </w:r>
-      <w:r>
-        <w:t xml:space="preserve"> 55 (2): 251–76.</w:t>
+        <w:t>Global Environmental Change</w:t>
+      </w:r>
+      <w:r>
+        <w:t xml:space="preserve"> 18 (1): 234–45. </w:t>
+      </w:r>
+      <w:hyperlink r:id="rId17">
+        <w:r>
+          <w:rPr>
+            <w:rStyle w:val="Hipervnculo"/>
+          </w:rPr>
+          <w:t>https://doi.org/10.1016/j.gloenvcha.2007.09.002</w:t>
+        </w:r>
+      </w:hyperlink>
+      <w:r>
+        <w:t>.</w:t>
       </w:r>
     </w:p>
     <w:p>
       <w:pPr>
         <w:pStyle w:val="Bibliografa"/>
       </w:pPr>
-      <w:bookmarkStart w:id="36" w:name="ref-eurostat_hicp"/>
-      <w:bookmarkEnd w:id="35"/>
-      <w:r>
-        <w:t xml:space="preserve">Eurostat. 2026. </w:t>
+      <w:bookmarkStart w:id="38" w:name="ref-Gereffi2005"/>
+      <w:bookmarkEnd w:id="37"/>
+      <w:r>
+        <w:t xml:space="preserve">Gereffi, Gary, John Humphrey, and Timothy Sturgeon. 2005. “The Governance of Global Value Chains.” </w:t>
       </w:r>
       <w:r>
         <w:rPr>
           <w:i/>
           <w:iCs/>
         </w:rPr>
-        <w:t>Harmonised Index of Consumer Prices (HICP) Metadata</w:t>
-      </w:r>
-      <w:r>
-        <w:t xml:space="preserve">. </w:t>
-      </w:r>
-      <w:hyperlink r:id="rId14">
+        <w:t>Review of International Political Economy</w:t>
+      </w:r>
+      <w:r>
+        <w:t xml:space="preserve"> 12 (1): 78–104. </w:t>
+      </w:r>
+      <w:hyperlink r:id="rId18">
         <w:r>
           <w:rPr>
             <w:rStyle w:val="Hipervnculo"/>
           </w:rPr>
-          <w:t>Https://ec.europa.eu/eurostat/cache/metadata/en/prc_hicp_esms.htm</w:t>
+          <w:t>https://doi.org/10.1080/09692290500049805</w:t>
         </w:r>
       </w:hyperlink>
       <w:r>
@@ -13061,8 +13329,8 @@
       <w:pPr>
         <w:pStyle w:val="Bibliografa"/>
       </w:pPr>
-      <w:bookmarkStart w:id="37" w:name="ref-hakkio_rush_1991"/>
-      <w:bookmarkEnd w:id="36"/>
+      <w:bookmarkStart w:id="39" w:name="ref-hakkio_rush_1991"/>
+      <w:bookmarkEnd w:id="38"/>
       <w:r>
         <w:t xml:space="preserve">Hakkio, Craig S., and Mark Rush. 1991. “Cointegration: How Short Is the Long-Run?” </w:t>
       </w:r>
@@ -13076,7 +13344,7 @@
       <w:r>
         <w:t xml:space="preserve"> 10 (4): 571–81. </w:t>
       </w:r>
-      <w:hyperlink r:id="rId15">
+      <w:hyperlink r:id="rId19">
         <w:r>
           <w:rPr>
             <w:rStyle w:val="Hipervnculo"/>
@@ -13091,108 +13359,197 @@
     <w:p>
       <w:pPr>
         <w:pStyle w:val="Bibliografa"/>
+      </w:pPr>
+      <w:bookmarkStart w:id="40" w:name="ref-Jacobi2013"/>
+      <w:bookmarkEnd w:id="39"/>
+      <w:r>
+        <w:t xml:space="preserve">Jacobi, Johanna, Monika Schneider, Patrick Bottazzi, Maria Isabel Pillco, Patricia Calizaya, and Stephan Rist. 2013. “Agroecosystem Resilience and Farmers’ Perceptions of Climate Change Impacts on Cocoa Farms in Alto Beni, Bolivia.” </w:t>
+      </w:r>
+      <w:r>
+        <w:rPr>
+          <w:i/>
+          <w:iCs/>
+        </w:rPr>
+        <w:t>Renewable Agriculture and Food Systems</w:t>
+      </w:r>
+      <w:r>
+        <w:t xml:space="preserve">, ahead of print. </w:t>
+      </w:r>
+      <w:hyperlink r:id="rId20">
+        <w:r>
+          <w:rPr>
+            <w:rStyle w:val="Hipervnculo"/>
+          </w:rPr>
+          <w:t>https://doi.org/10.1017/S174217051300029X</w:t>
+        </w:r>
+      </w:hyperlink>
+      <w:r>
+        <w:t>.</w:t>
+      </w:r>
+    </w:p>
+    <w:p>
+      <w:pPr>
+        <w:pStyle w:val="Bibliografa"/>
+      </w:pPr>
+      <w:bookmarkStart w:id="41" w:name="ref-JimenezRodriguez2022"/>
+      <w:bookmarkEnd w:id="40"/>
+      <w:r>
         <w:rPr>
           <w:lang w:val="es-ES"/>
         </w:rPr>
-      </w:pPr>
-      <w:bookmarkStart w:id="38" w:name="ref-johansen_1991"/>
-      <w:bookmarkEnd w:id="37"/>
+        <w:t xml:space="preserve">Jiménez-Rodrı́guez, Rebeca, and Amalia Morales-Zumaquero. </w:t>
+      </w:r>
+      <w:r>
+        <w:t xml:space="preserve">2022. “Commodity Price Pass-Through Along the Pricing Chain.” </w:t>
+      </w:r>
+      <w:r>
+        <w:rPr>
+          <w:i/>
+          <w:iCs/>
+        </w:rPr>
+        <w:t>Review of World Economics</w:t>
+      </w:r>
+      <w:r>
+        <w:t xml:space="preserve"> 158 (1): 109–25. </w:t>
+      </w:r>
+      <w:hyperlink r:id="rId21">
+        <w:r>
+          <w:rPr>
+            <w:rStyle w:val="Hipervnculo"/>
+          </w:rPr>
+          <w:t>https://doi.org/10.1007/s10290-021-00425-2</w:t>
+        </w:r>
+      </w:hyperlink>
+      <w:r>
+        <w:t>.</w:t>
+      </w:r>
+    </w:p>
+    <w:p>
+      <w:pPr>
+        <w:pStyle w:val="Bibliografa"/>
+      </w:pPr>
+      <w:bookmarkStart w:id="42" w:name="ref-johansen_1991"/>
+      <w:bookmarkEnd w:id="41"/>
       <w:r>
         <w:t xml:space="preserve">Johansen, Soren. 1991. “Estimation and Hypothesis Testing of Cointegration Vectors in Gaussian Vector Autoregressive Models.” </w:t>
       </w:r>
+      <w:r>
+        <w:rPr>
+          <w:i/>
+          <w:iCs/>
+        </w:rPr>
+        <w:t>Econometrica</w:t>
+      </w:r>
+      <w:r>
+        <w:t xml:space="preserve"> 59 (6): 1551–80.</w:t>
+      </w:r>
+    </w:p>
+    <w:p>
+      <w:pPr>
+        <w:pStyle w:val="Bibliografa"/>
+      </w:pPr>
+      <w:bookmarkStart w:id="43" w:name="ref-Jumah2001"/>
+      <w:bookmarkEnd w:id="42"/>
+      <w:r>
+        <w:t xml:space="preserve">Jumah, A., and Robert M. Kunst. 2001. “The Effects of Dollar/Sterling Exchange Rate Volatility on Futures Markets for Coffee and Cocoa.” </w:t>
+      </w:r>
+      <w:r>
+        <w:rPr>
+          <w:i/>
+          <w:iCs/>
+        </w:rPr>
+        <w:t>European Review of Agricultural Economics</w:t>
+      </w:r>
+      <w:r>
+        <w:t xml:space="preserve"> 28 (3): 307–20. </w:t>
+      </w:r>
+      <w:hyperlink r:id="rId22">
+        <w:r>
+          <w:rPr>
+            <w:rStyle w:val="Hipervnculo"/>
+          </w:rPr>
+          <w:t>https://doi.org/10.1093/erae/28.3.307</w:t>
+        </w:r>
+      </w:hyperlink>
+      <w:r>
+        <w:t>.</w:t>
+      </w:r>
+    </w:p>
+    <w:p>
+      <w:pPr>
+        <w:pStyle w:val="Bibliografa"/>
+      </w:pPr>
+      <w:bookmarkStart w:id="44" w:name="ref-Koh2020"/>
+      <w:bookmarkEnd w:id="43"/>
+      <w:r>
+        <w:lastRenderedPageBreak/>
+        <w:t xml:space="preserve">Koh, I., Rachael Garrett, Anthony C. Janetos, and Nathaniel D. Mueller. 2020. “Climate Risks to Brazilian Coffee Production.” </w:t>
+      </w:r>
+      <w:r>
+        <w:rPr>
+          <w:i/>
+          <w:iCs/>
+        </w:rPr>
+        <w:t>Environmental Research Letters</w:t>
+      </w:r>
+      <w:r>
+        <w:t xml:space="preserve">, ahead of print. </w:t>
+      </w:r>
+      <w:hyperlink r:id="rId23">
+        <w:r>
+          <w:rPr>
+            <w:rStyle w:val="Hipervnculo"/>
+          </w:rPr>
+          <w:t>https://doi.org/10.1088/1748-9326/aba471</w:t>
+        </w:r>
+      </w:hyperlink>
+      <w:r>
+        <w:t>.</w:t>
+      </w:r>
+    </w:p>
+    <w:p>
+      <w:pPr>
+        <w:pStyle w:val="Bibliografa"/>
+        <w:rPr>
+          <w:lang w:val="es-ES"/>
+        </w:rPr>
+      </w:pPr>
+      <w:bookmarkStart w:id="45" w:name="ref-Laderach2013"/>
+      <w:bookmarkEnd w:id="44"/>
+      <w:r>
+        <w:t xml:space="preserve">Laderach, Peter, Armando Martinez-Valle, Goetz Schroth, and Nixon Castro. 2013. “Predicting the Future Climatic Suitability for Cocoa Farming of the World’s Leading Producer Countries, Ghana and Cote d’ivoire.” </w:t>
+      </w:r>
+      <w:proofErr w:type="spellStart"/>
       <w:r>
         <w:rPr>
           <w:i/>
           <w:iCs/>
           <w:lang w:val="es-ES"/>
         </w:rPr>
-        <w:t>Econometrica</w:t>
-      </w:r>
-      <w:r>
-        <w:rPr>
-          <w:lang w:val="es-ES"/>
-        </w:rPr>
-        <w:t xml:space="preserve"> 59 (6): 1551–80.</w:t>
-      </w:r>
-    </w:p>
-    <w:p>
-      <w:pPr>
-        <w:pStyle w:val="Bibliografa"/>
-      </w:pPr>
-      <w:bookmarkStart w:id="39" w:name="ref-agronet_cacao"/>
-      <w:bookmarkEnd w:id="38"/>
-      <w:r>
-        <w:rPr>
-          <w:lang w:val="es-ES"/>
-        </w:rPr>
-        <w:lastRenderedPageBreak/>
-        <w:t xml:space="preserve">Ministerio de Agricultura y Desarrollo Rural. 2026. </w:t>
-      </w:r>
+        <w:t>Climatic</w:t>
+      </w:r>
+      <w:proofErr w:type="spellEnd"/>
       <w:r>
         <w:rPr>
           <w:i/>
           <w:iCs/>
           <w:lang w:val="es-ES"/>
         </w:rPr>
-        <w:t>Precio de Referencia Semanal de Compra de Cacao - Fuente Industria Nacional - Exportadores</w:t>
+        <w:t xml:space="preserve"> Change</w:t>
       </w:r>
       <w:r>
         <w:rPr>
           <w:lang w:val="es-ES"/>
         </w:rPr>
-        <w:t xml:space="preserve">. </w:t>
-      </w:r>
-      <w:hyperlink r:id="rId16">
-        <w:r>
-          <w:rPr>
-            <w:rStyle w:val="Hipervnculo"/>
-          </w:rPr>
-          <w:t>Https://www.agronet.gov.co/Noticias/Paginas/Precio-de-referencia-semanal-de-compra-de-cacao---Fuente-Industria.aspx</w:t>
-        </w:r>
-      </w:hyperlink>
-      <w:r>
-        <w:t>.</w:t>
-      </w:r>
-    </w:p>
-    <w:p>
-      <w:pPr>
-        <w:pStyle w:val="Bibliografa"/>
-        <w:rPr>
-          <w:lang w:val="es-ES"/>
-        </w:rPr>
-      </w:pPr>
-      <w:bookmarkStart w:id="40" w:name="ref-nasa_power_api"/>
-      <w:bookmarkEnd w:id="39"/>
-      <w:r>
-        <w:t xml:space="preserve">National Aeronautics and Space Administration. </w:t>
-      </w:r>
-      <w:r>
-        <w:rPr>
-          <w:lang w:val="es-ES"/>
-        </w:rPr>
-        <w:t xml:space="preserve">2026. </w:t>
-      </w:r>
-      <w:r>
-        <w:rPr>
-          <w:i/>
-          <w:iCs/>
-          <w:lang w:val="es-ES"/>
-        </w:rPr>
-        <w:t>NASA POWER Temporal APIs Documentation</w:t>
-      </w:r>
-      <w:r>
-        <w:rPr>
-          <w:lang w:val="es-ES"/>
-        </w:rPr>
-        <w:t xml:space="preserve">. </w:t>
-      </w:r>
-      <w:hyperlink r:id="rId17">
+        <w:t xml:space="preserve"> 119 (3-4): 841–54. </w:t>
+      </w:r>
+      <w:hyperlink r:id="rId24">
         <w:r>
           <w:rPr>
             <w:rStyle w:val="Hipervnculo"/>
             <w:lang w:val="es-ES"/>
           </w:rPr>
-          <w:t>Https://power.larc.nasa.gov/docs/services/api/temporal/</w:t>
+          <w:t>https://doi.org/10.1007/s10584-013-0774-8</w:t>
         </w:r>
       </w:hyperlink>
       <w:r>
@@ -13206,13 +13563,324 @@
       <w:pPr>
         <w:pStyle w:val="Bibliografa"/>
       </w:pPr>
-      <w:bookmarkStart w:id="41" w:name="ref-talero_sarmiento_etal_2025"/>
-      <w:bookmarkEnd w:id="40"/>
+      <w:bookmarkStart w:id="46" w:name="ref-Laderach2016"/>
+      <w:bookmarkEnd w:id="45"/>
       <w:r>
         <w:rPr>
           <w:lang w:val="es-ES"/>
         </w:rPr>
-        <w:t xml:space="preserve">Talero-Sarmiento, Leonardo H., Henry Lamos-Diaz, and Juan D. Marquez-Gonzalez. </w:t>
+        <w:t xml:space="preserve">Laderach, Peter, </w:t>
+      </w:r>
+      <w:proofErr w:type="spellStart"/>
+      <w:r>
+        <w:rPr>
+          <w:lang w:val="es-ES"/>
+        </w:rPr>
+        <w:t>Julian</w:t>
+      </w:r>
+      <w:proofErr w:type="spellEnd"/>
+      <w:r>
+        <w:rPr>
+          <w:lang w:val="es-ES"/>
+        </w:rPr>
+        <w:t xml:space="preserve"> </w:t>
+      </w:r>
+      <w:proofErr w:type="spellStart"/>
+      <w:r>
+        <w:rPr>
+          <w:lang w:val="es-ES"/>
+        </w:rPr>
+        <w:t>Ramirez</w:t>
+      </w:r>
+      <w:proofErr w:type="spellEnd"/>
+      <w:r>
+        <w:rPr>
+          <w:lang w:val="es-ES"/>
+        </w:rPr>
+        <w:t xml:space="preserve">-Villegas, Carlos E. Navarro Racines, Carlos Zelaya, Armando </w:t>
+      </w:r>
+      <w:proofErr w:type="spellStart"/>
+      <w:r>
+        <w:rPr>
+          <w:lang w:val="es-ES"/>
+        </w:rPr>
+        <w:t>Martinez</w:t>
+      </w:r>
+      <w:proofErr w:type="spellEnd"/>
+      <w:r>
+        <w:rPr>
+          <w:lang w:val="es-ES"/>
+        </w:rPr>
+        <w:t xml:space="preserve">-Valle, and Andy Jarvis. </w:t>
+      </w:r>
+      <w:r>
+        <w:t xml:space="preserve">2016. “Climate Change Adaptation of Coffee Production in Space and Time.” </w:t>
+      </w:r>
+      <w:r>
+        <w:rPr>
+          <w:i/>
+          <w:iCs/>
+        </w:rPr>
+        <w:t>Climatic Change</w:t>
+      </w:r>
+      <w:r>
+        <w:t xml:space="preserve">, ahead of print. </w:t>
+      </w:r>
+      <w:hyperlink r:id="rId25">
+        <w:r>
+          <w:rPr>
+            <w:rStyle w:val="Hipervnculo"/>
+          </w:rPr>
+          <w:t>https://doi.org/10.1007/s10584-016-1788-9</w:t>
+        </w:r>
+      </w:hyperlink>
+      <w:r>
+        <w:t>.</w:t>
+      </w:r>
+    </w:p>
+    <w:p>
+      <w:pPr>
+        <w:pStyle w:val="Bibliografa"/>
+      </w:pPr>
+      <w:bookmarkStart w:id="47" w:name="ref-Lahive2019"/>
+      <w:bookmarkEnd w:id="46"/>
+      <w:r>
+        <w:t xml:space="preserve">Lahive, Fiona, Paul Hadley, and Andrew J. Daymond. 2019. “The Physiological Responses of Cacao to the Environment and the Implications for Climate Change Resilience. A Review.” </w:t>
+      </w:r>
+      <w:r>
+        <w:rPr>
+          <w:i/>
+          <w:iCs/>
+        </w:rPr>
+        <w:t>Agronomy for Sustainable Development</w:t>
+      </w:r>
+      <w:r>
+        <w:t xml:space="preserve"> 39 (1): 5. </w:t>
+      </w:r>
+      <w:hyperlink r:id="rId26">
+        <w:r>
+          <w:rPr>
+            <w:rStyle w:val="Hipervnculo"/>
+          </w:rPr>
+          <w:t>https://doi.org/10.1007/s13593-018-0552-0</w:t>
+        </w:r>
+      </w:hyperlink>
+      <w:r>
+        <w:t>.</w:t>
+      </w:r>
+    </w:p>
+    <w:p>
+      <w:pPr>
+        <w:pStyle w:val="Bibliografa"/>
+      </w:pPr>
+      <w:bookmarkStart w:id="48" w:name="ref-Merkle2021"/>
+      <w:bookmarkEnd w:id="47"/>
+      <w:r>
+        <w:t xml:space="preserve">Merkle, Magnus, Dominic Moran, Frances Warren, and Peter Alexander. 2021. “How Does Market Power Affect the Resilience of Food Supply?” </w:t>
+      </w:r>
+      <w:r>
+        <w:rPr>
+          <w:i/>
+          <w:iCs/>
+        </w:rPr>
+        <w:t>Global Food Security</w:t>
+      </w:r>
+      <w:r>
+        <w:t xml:space="preserve"> 30: 100556. </w:t>
+      </w:r>
+      <w:hyperlink r:id="rId27">
+        <w:r>
+          <w:rPr>
+            <w:rStyle w:val="Hipervnculo"/>
+          </w:rPr>
+          <w:t>https://doi.org/10.1016/j.gfs.2021.100556</w:t>
+        </w:r>
+      </w:hyperlink>
+      <w:r>
+        <w:t>.</w:t>
+      </w:r>
+    </w:p>
+    <w:p>
+      <w:pPr>
+        <w:pStyle w:val="Bibliografa"/>
+      </w:pPr>
+      <w:bookmarkStart w:id="49" w:name="ref-MeyerCramon2004"/>
+      <w:bookmarkEnd w:id="48"/>
+      <w:r>
+        <w:t xml:space="preserve">Meyer, Jochen, and Stephan von Cramon-Taubadel. 2004. “Asymmetric Price Transmission: A Survey.” </w:t>
+      </w:r>
+      <w:r>
+        <w:rPr>
+          <w:i/>
+          <w:iCs/>
+        </w:rPr>
+        <w:t>Journal of Agricultural Economics</w:t>
+      </w:r>
+      <w:r>
+        <w:t xml:space="preserve"> 55 (3): 581–611. </w:t>
+      </w:r>
+      <w:hyperlink r:id="rId28">
+        <w:r>
+          <w:rPr>
+            <w:rStyle w:val="Hipervnculo"/>
+          </w:rPr>
+          <w:t>https://doi.org/10.1111/j.1477-9552.2004.tb00116.x</w:t>
+        </w:r>
+      </w:hyperlink>
+      <w:r>
+        <w:t>.</w:t>
+      </w:r>
+    </w:p>
+    <w:p>
+      <w:pPr>
+        <w:pStyle w:val="Bibliografa"/>
+      </w:pPr>
+      <w:bookmarkStart w:id="50" w:name="ref-Mithofer2017"/>
+      <w:bookmarkEnd w:id="49"/>
+      <w:r>
+        <w:t xml:space="preserve">Mithofer, Dagmar, James M. Roshetko, Jason A. Donovan, et al. 2017. “Unpacking ‘Sustainable’ Cocoa: Do Sustainability Standards, Development Projects and Policies Address Producer Concerns in Indonesia, Cameroon and Peru?” </w:t>
+      </w:r>
+      <w:r>
+        <w:rPr>
+          <w:i/>
+          <w:iCs/>
+        </w:rPr>
+        <w:t>International Journal of Biodiversity Science, Ecosystem Services &amp; Management</w:t>
+      </w:r>
+      <w:r>
+        <w:t xml:space="preserve"> 13 (1): 444–69. </w:t>
+      </w:r>
+      <w:hyperlink r:id="rId29">
+        <w:r>
+          <w:rPr>
+            <w:rStyle w:val="Hipervnculo"/>
+          </w:rPr>
+          <w:t>https://doi.org/10.1080/21513732.2018.1432691</w:t>
+        </w:r>
+      </w:hyperlink>
+      <w:r>
+        <w:t>.</w:t>
+      </w:r>
+    </w:p>
+    <w:p>
+      <w:pPr>
+        <w:pStyle w:val="Bibliografa"/>
+      </w:pPr>
+      <w:bookmarkStart w:id="51" w:name="ref-Morales2022"/>
+      <w:bookmarkEnd w:id="50"/>
+      <w:r>
+        <w:t xml:space="preserve">Morales, Laura V., Valentina Robiglio, Maria Baca, Christian Bunn, and Martin Reyes. 2022. “Planning for Adaptation: A System Approach to Understand the Value Chain’s Role in Supporting Smallholder Coffee Farmers’ Adaptive Capacity in Peru.” </w:t>
+      </w:r>
+      <w:r>
+        <w:rPr>
+          <w:i/>
+          <w:iCs/>
+        </w:rPr>
+        <w:t>Frontiers in Climate</w:t>
+      </w:r>
+      <w:r>
+        <w:t xml:space="preserve">, ahead of print. </w:t>
+      </w:r>
+      <w:hyperlink r:id="rId30">
+        <w:r>
+          <w:rPr>
+            <w:rStyle w:val="Hipervnculo"/>
+          </w:rPr>
+          <w:t>https://doi.org/10.3389/fclim.2022.788369</w:t>
+        </w:r>
+      </w:hyperlink>
+      <w:r>
+        <w:t>.</w:t>
+      </w:r>
+    </w:p>
+    <w:p>
+      <w:pPr>
+        <w:pStyle w:val="Bibliografa"/>
+      </w:pPr>
+      <w:bookmarkStart w:id="52" w:name="ref-Niether2020"/>
+      <w:bookmarkEnd w:id="51"/>
+      <w:r>
+        <w:t xml:space="preserve">Niether, Wiebke, Johanna Jacobi, Wilma J. Blaser, Christian Andres, and Laura Armengot. 2020. “Cocoa Agroforestry Systems Versus Monocultures: A Multi-Dimensional Meta-Analysis.” </w:t>
+      </w:r>
+      <w:r>
+        <w:rPr>
+          <w:i/>
+          <w:iCs/>
+        </w:rPr>
+        <w:t>Environmental Research Letters</w:t>
+      </w:r>
+      <w:r>
+        <w:t xml:space="preserve">, ahead of print. </w:t>
+      </w:r>
+      <w:hyperlink r:id="rId31">
+        <w:r>
+          <w:rPr>
+            <w:rStyle w:val="Hipervnculo"/>
+          </w:rPr>
+          <w:t>https://doi.org/10.1088/1748-9326/abb053</w:t>
+        </w:r>
+      </w:hyperlink>
+      <w:r>
+        <w:t>.</w:t>
+      </w:r>
+    </w:p>
+    <w:p>
+      <w:pPr>
+        <w:pStyle w:val="Bibliografa"/>
+      </w:pPr>
+      <w:bookmarkStart w:id="53" w:name="ref-Schroth2016"/>
+      <w:bookmarkEnd w:id="52"/>
+      <w:r>
+        <w:t xml:space="preserve">Schroth, Goetz, Peter Laderach, Armando Isaac Martinez-Valle, Christian Bunn, and Laurence Jassogne. 2016. “Vulnerability to Climate Change of Cocoa in West Africa: Patterns, Opportunities and Limits to Adaptation.” </w:t>
+      </w:r>
+      <w:r>
+        <w:rPr>
+          <w:i/>
+          <w:iCs/>
+        </w:rPr>
+        <w:t>Science of The Total Environment</w:t>
+      </w:r>
+      <w:r>
+        <w:t xml:space="preserve"> 556: 231–41. </w:t>
+      </w:r>
+      <w:hyperlink r:id="rId32">
+        <w:r>
+          <w:rPr>
+            <w:rStyle w:val="Hipervnculo"/>
+          </w:rPr>
+          <w:t>https://doi.org/10.1016/j.scitotenv.2016.03.024</w:t>
+        </w:r>
+      </w:hyperlink>
+      <w:r>
+        <w:t>.</w:t>
+      </w:r>
+    </w:p>
+    <w:p>
+      <w:pPr>
+        <w:pStyle w:val="Bibliografa"/>
+      </w:pPr>
+      <w:bookmarkStart w:id="54" w:name="ref-talero_sarmiento_etal_2025"/>
+      <w:bookmarkEnd w:id="53"/>
+      <w:r>
+        <w:rPr>
+          <w:lang w:val="es-ES"/>
+        </w:rPr>
+        <w:lastRenderedPageBreak/>
+        <w:t>Talero-Sarmiento, Leonardo H., Henry Lamos-Diaz, and Juan D. Marquez-</w:t>
+      </w:r>
+      <w:proofErr w:type="spellStart"/>
+      <w:r>
+        <w:rPr>
+          <w:lang w:val="es-ES"/>
+        </w:rPr>
+        <w:t>Gonzalez</w:t>
+      </w:r>
+      <w:proofErr w:type="spellEnd"/>
+      <w:r>
+        <w:rPr>
+          <w:lang w:val="es-ES"/>
+        </w:rPr>
+        <w:t xml:space="preserve">. </w:t>
       </w:r>
       <w:r>
         <w:t xml:space="preserve">2025. “Optimizing Cocoa Biomass Density Through Integrated Irrigation and Drainage Management Under Water Stress: A Linear Programming Approach.” </w:t>
@@ -13227,7 +13895,7 @@
       <w:r>
         <w:t xml:space="preserve"> 90: 103262. </w:t>
       </w:r>
-      <w:hyperlink r:id="rId18">
+      <w:hyperlink r:id="rId33">
         <w:r>
           <w:rPr>
             <w:rStyle w:val="Hipervnculo"/>
@@ -13243,8 +13911,39 @@
       <w:pPr>
         <w:pStyle w:val="Bibliografa"/>
       </w:pPr>
-      <w:bookmarkStart w:id="42" w:name="ref-troyanskaya_etal_2001"/>
-      <w:bookmarkEnd w:id="41"/>
+      <w:bookmarkStart w:id="55" w:name="ref-Tendall2015"/>
+      <w:bookmarkEnd w:id="54"/>
+      <w:r>
+        <w:t xml:space="preserve">Tendall, Danielle M., Jonas Joerin, Birgit Kopainsky, et al. 2015. “Food System Resilience: Defining the Concept.” </w:t>
+      </w:r>
+      <w:r>
+        <w:rPr>
+          <w:i/>
+          <w:iCs/>
+        </w:rPr>
+        <w:t>Global Food Security</w:t>
+      </w:r>
+      <w:r>
+        <w:t xml:space="preserve"> 6: 17–23. </w:t>
+      </w:r>
+      <w:hyperlink r:id="rId34">
+        <w:r>
+          <w:rPr>
+            <w:rStyle w:val="Hipervnculo"/>
+          </w:rPr>
+          <w:t>https://doi.org/10.1016/j.gfs.2015.08.001</w:t>
+        </w:r>
+      </w:hyperlink>
+      <w:r>
+        <w:t>.</w:t>
+      </w:r>
+    </w:p>
+    <w:p>
+      <w:pPr>
+        <w:pStyle w:val="Bibliografa"/>
+      </w:pPr>
+      <w:bookmarkStart w:id="56" w:name="ref-troyanskaya_etal_2001"/>
+      <w:bookmarkEnd w:id="55"/>
       <w:r>
         <w:t xml:space="preserve">Troyanskaya, Olga, Michael Cantor, Gavin Sherlock, et al. 2001. “Missing Value Estimation Methods for DNA Microarrays.” </w:t>
       </w:r>
@@ -13258,7 +13957,7 @@
       <w:r>
         <w:t xml:space="preserve"> 17 (6): 520–25. </w:t>
       </w:r>
-      <w:hyperlink r:id="rId19">
+      <w:hyperlink r:id="rId35">
         <w:r>
           <w:rPr>
             <w:rStyle w:val="Hipervnculo"/>
@@ -13274,27 +13973,27 @@
       <w:pPr>
         <w:pStyle w:val="Bibliografa"/>
       </w:pPr>
-      <w:bookmarkStart w:id="43" w:name="ref-eia_brent"/>
-      <w:bookmarkEnd w:id="42"/>
-      <w:r>
-        <w:t xml:space="preserve">U.S. Energy Information Administration. 2026. </w:t>
+      <w:bookmarkStart w:id="57" w:name="ref-TsowouGayi2019"/>
+      <w:bookmarkEnd w:id="56"/>
+      <w:r>
+        <w:t xml:space="preserve">Tsowou, Komi, and Samuel K. Gayi. 2019. “Trade Reforms and Integration of Cocoa Farmers into World Markets: Evidence from African and Non-African Countries.” </w:t>
       </w:r>
       <w:r>
         <w:rPr>
           <w:i/>
           <w:iCs/>
         </w:rPr>
-        <w:t>Europe Brent Spot Price FOB</w:t>
-      </w:r>
-      <w:r>
-        <w:t xml:space="preserve">. </w:t>
-      </w:r>
-      <w:hyperlink r:id="rId20">
+        <w:t>Journal of African Trade</w:t>
+      </w:r>
+      <w:r>
+        <w:t xml:space="preserve">, ahead of print. </w:t>
+      </w:r>
+      <w:hyperlink r:id="rId36">
         <w:r>
           <w:rPr>
             <w:rStyle w:val="Hipervnculo"/>
           </w:rPr>
-          <w:t>Https://www.eia.gov/dnav/pet/hist/LeafHandler.ashx?n=PET&amp;s=RBRTE&amp;f=M</w:t>
+          <w:t>https://doi.org/10.2991/jat.k.190916.001</w:t>
         </w:r>
       </w:hyperlink>
       <w:r>
@@ -13305,35 +14004,134 @@
       <w:pPr>
         <w:pStyle w:val="Bibliografa"/>
       </w:pPr>
-      <w:bookmarkStart w:id="44" w:name="ref-worldbank_pinksheet"/>
-      <w:bookmarkEnd w:id="43"/>
-      <w:r>
-        <w:t xml:space="preserve">World Bank Prospects Group. 2025. </w:t>
+      <w:bookmarkStart w:id="58" w:name="ref-Turner2003"/>
+      <w:bookmarkEnd w:id="57"/>
+      <w:r>
+        <w:rPr>
+          <w:lang w:val="de-DE"/>
+        </w:rPr>
+        <w:t xml:space="preserve">Turner, B. L., Roger E. Kasperson, Pamela A. Matson, et al. 2003. </w:t>
+      </w:r>
+      <w:r>
+        <w:t xml:space="preserve">“A Framework for Vulnerability Analysis in Sustainability Science.” </w:t>
       </w:r>
       <w:r>
         <w:rPr>
           <w:i/>
           <w:iCs/>
         </w:rPr>
-        <w:t>World Bank Commodities Price Data (the Pink Sheet)</w:t>
-      </w:r>
-      <w:r>
-        <w:t xml:space="preserve">. </w:t>
-      </w:r>
-      <w:hyperlink r:id="rId21">
+        <w:t>Proceedings of the National Academy of Sciences of the United States of America</w:t>
+      </w:r>
+      <w:r>
+        <w:t xml:space="preserve"> 100 (14): 8074–79. </w:t>
+      </w:r>
+      <w:hyperlink r:id="rId37">
         <w:r>
           <w:rPr>
             <w:rStyle w:val="Hipervnculo"/>
           </w:rPr>
-          <w:t>Https://thedocs.worldbank.org/en/doc/18675f1d1639c7a34d463f59263ba0a2-0050012025/world-bank-commodities-price-data-the-pink-sheet</w:t>
+          <w:t>https://doi.org/10.1073/pnas.1231335100</w:t>
         </w:r>
       </w:hyperlink>
       <w:r>
         <w:t>.</w:t>
       </w:r>
-      <w:bookmarkEnd w:id="30"/>
-      <w:bookmarkEnd w:id="32"/>
-      <w:bookmarkEnd w:id="44"/>
+    </w:p>
+    <w:p>
+      <w:pPr>
+        <w:pStyle w:val="Bibliografa"/>
+      </w:pPr>
+      <w:bookmarkStart w:id="59" w:name="ref-Vaast2014"/>
+      <w:bookmarkEnd w:id="58"/>
+      <w:r>
+        <w:t xml:space="preserve">Vaast, Philippe, and Eduardo Somarriba. 2014. “Trade-Offs Between Crop Intensification and Ecosystem Services: The Role of Agroforestry in Cocoa Cultivation.” </w:t>
+      </w:r>
+      <w:r>
+        <w:rPr>
+          <w:i/>
+          <w:iCs/>
+        </w:rPr>
+        <w:t>Agroforestry Systems</w:t>
+      </w:r>
+      <w:r>
+        <w:t xml:space="preserve"> 88 (6): 947–56. </w:t>
+      </w:r>
+      <w:hyperlink r:id="rId38">
+        <w:r>
+          <w:rPr>
+            <w:rStyle w:val="Hipervnculo"/>
+          </w:rPr>
+          <w:t>https://doi.org/10.1007/s10457-014-9762-x</w:t>
+        </w:r>
+      </w:hyperlink>
+      <w:r>
+        <w:t>.</w:t>
+      </w:r>
+    </w:p>
+    <w:p>
+      <w:pPr>
+        <w:pStyle w:val="Bibliografa"/>
+      </w:pPr>
+      <w:bookmarkStart w:id="60" w:name="ref-Verburg2019"/>
+      <w:bookmarkEnd w:id="59"/>
+      <w:r>
+        <w:t xml:space="preserve">Verburg, R. W., Eric Rahn, P. A. Verweij, Marijke van Kuijk, and Jaboury Ghazoul. 2019. “An Innovation Perspective to Climate Change Adaptation in Coffee Systems.” </w:t>
+      </w:r>
+      <w:r>
+        <w:rPr>
+          <w:i/>
+          <w:iCs/>
+        </w:rPr>
+        <w:t>Environmental Science &amp; Policy</w:t>
+      </w:r>
+      <w:r>
+        <w:t xml:space="preserve">, ahead of print. </w:t>
+      </w:r>
+      <w:hyperlink r:id="rId39">
+        <w:r>
+          <w:rPr>
+            <w:rStyle w:val="Hipervnculo"/>
+          </w:rPr>
+          <w:t>https://doi.org/10.1016/j.envsci.2019.03.017</w:t>
+        </w:r>
+      </w:hyperlink>
+      <w:r>
+        <w:t>.</w:t>
+      </w:r>
+    </w:p>
+    <w:p>
+      <w:pPr>
+        <w:pStyle w:val="Bibliografa"/>
+      </w:pPr>
+      <w:bookmarkStart w:id="61" w:name="ref-Zurek2022"/>
+      <w:bookmarkEnd w:id="60"/>
+      <w:r>
+        <w:t xml:space="preserve">Zurek, Monika, John Ingram, Angelina Sanderson Bellamy, et al. 2022. “Food System Resilience: Concepts, Issues, and Challenges.” </w:t>
+      </w:r>
+      <w:r>
+        <w:rPr>
+          <w:i/>
+          <w:iCs/>
+        </w:rPr>
+        <w:t>Annual Review of Environment and Resources</w:t>
+      </w:r>
+      <w:r>
+        <w:t xml:space="preserve"> 47: 511–34. </w:t>
+      </w:r>
+      <w:hyperlink r:id="rId40">
+        <w:r>
+          <w:rPr>
+            <w:rStyle w:val="Hipervnculo"/>
+          </w:rPr>
+          <w:t>https://doi.org/10.1146/annurev-environ-112320-050744</w:t>
+        </w:r>
+      </w:hyperlink>
+      <w:r>
+        <w:t>.</w:t>
+      </w:r>
+      <w:bookmarkEnd w:id="31"/>
+      <w:bookmarkEnd w:id="33"/>
+      <w:bookmarkEnd w:id="61"/>
     </w:p>
     <w:sectPr>
       <w:footnotePr>
@@ -13347,12 +14145,62 @@
 </w:document>
 </file>
 
+<file path=word/endnotes.xml><?xml version="1.0" encoding="utf-8"?>
+<w:endnotes xmlns:wpc="http://schemas.microsoft.com/office/word/2010/wordprocessingCanvas" xmlns:cx="http://schemas.microsoft.com/office/drawing/2014/chartex" xmlns:cx1="http://schemas.microsoft.com/office/drawing/2015/9/8/chartex" xmlns:cx2="http://schemas.microsoft.com/office/drawing/2015/10/21/chartex" xmlns:cx3="http://schemas.microsoft.com/office/drawing/2016/5/9/chartex" xmlns:cx4="http://schemas.microsoft.com/office/drawing/2016/5/10/chartex" xmlns:cx5="http://schemas.microsoft.com/office/drawing/2016/5/11/chartex" xmlns:cx6="http://schemas.microsoft.com/office/drawing/2016/5/12/chartex" xmlns:cx7="http://schemas.microsoft.com/office/drawing/2016/5/13/chartex" xmlns:cx8="http://schemas.microsoft.com/office/drawing/2016/5/14/chartex" xmlns:mc="http://schemas.openxmlformats.org/markup-compatibility/2006" xmlns:aink="http://schemas.microsoft.com/office/drawing/2016/ink" xmlns:am3d="http://schemas.microsoft.com/office/drawing/2017/model3d" xmlns:o="urn:schemas-microsoft-com:office:office" xmlns:oel="http://schemas.microsoft.com/office/2019/extlst" xmlns:r="http://schemas.openxmlformats.org/officeDocument/2006/relationships" xmlns:m="http://schemas.openxmlformats.org/officeDocument/2006/math" xmlns:v="urn:schemas-microsoft-com:vml" xmlns:wp14="http://schemas.microsoft.com/office/word/2010/wordprocessingDrawing" xmlns:wp="http://schemas.openxmlformats.org/drawingml/2006/wordprocessingDrawing" xmlns:w10="urn:schemas-microsoft-com:office:word" xmlns:w="http://schemas.openxmlformats.org/wordprocessingml/2006/main" xmlns:w14="http://schemas.microsoft.com/office/word/2010/wordml" xmlns:w15="http://schemas.microsoft.com/office/word/2012/wordml" xmlns:w16cex="http://schemas.microsoft.com/office/word/2018/wordml/cex" xmlns:w16cid="http://schemas.microsoft.com/office/word/2016/wordml/cid" xmlns:w16="http://schemas.microsoft.com/office/word/2018/wordml" xmlns:w16du="http://schemas.microsoft.com/office/word/2023/wordml/word16du" xmlns:w16sdtdh="http://schemas.microsoft.com/office/word/2020/wordml/sdtdatahash" xmlns:w16sdtfl="http://schemas.microsoft.com/office/word/2024/wordml/sdtformatlock" xmlns:w16se="http://schemas.microsoft.com/office/word/2015/wordml/symex" xmlns:wpg="http://schemas.microsoft.com/office/word/2010/wordprocessingGroup" xmlns:wpi="http://schemas.microsoft.com/office/word/2010/wordprocessingInk" xmlns:wne="http://schemas.microsoft.com/office/word/2006/wordml" xmlns:wps="http://schemas.microsoft.com/office/word/2010/wordprocessingShape" mc:Ignorable="w14 w15 w16se w16cid w16 w16cex w16sdtdh w16sdtfl w16du wp14">
+  <w:endnote w:type="separator" w:id="-1">
+    <w:p>
+      <w:pPr>
+        <w:spacing w:after="0"/>
+      </w:pPr>
+      <w:r>
+        <w:separator/>
+      </w:r>
+    </w:p>
+  </w:endnote>
+  <w:endnote w:type="continuationSeparator" w:id="0">
+    <w:p>
+      <w:pPr>
+        <w:spacing w:after="0"/>
+      </w:pPr>
+      <w:r>
+        <w:continuationSeparator/>
+      </w:r>
+    </w:p>
+  </w:endnote>
+</w:endnotes>
+</file>
+
+<file path=word/footnotes.xml><?xml version="1.0" encoding="utf-8"?>
+<w:footnotes xmlns:wpc="http://schemas.microsoft.com/office/word/2010/wordprocessingCanvas" xmlns:cx="http://schemas.microsoft.com/office/drawing/2014/chartex" xmlns:cx1="http://schemas.microsoft.com/office/drawing/2015/9/8/chartex" xmlns:cx2="http://schemas.microsoft.com/office/drawing/2015/10/21/chartex" xmlns:cx3="http://schemas.microsoft.com/office/drawing/2016/5/9/chartex" xmlns:cx4="http://schemas.microsoft.com/office/drawing/2016/5/10/chartex" xmlns:cx5="http://schemas.microsoft.com/office/drawing/2016/5/11/chartex" xmlns:cx6="http://schemas.microsoft.com/office/drawing/2016/5/12/chartex" xmlns:cx7="http://schemas.microsoft.com/office/drawing/2016/5/13/chartex" xmlns:cx8="http://schemas.microsoft.com/office/drawing/2016/5/14/chartex" xmlns:mc="http://schemas.openxmlformats.org/markup-compatibility/2006" xmlns:aink="http://schemas.microsoft.com/office/drawing/2016/ink" xmlns:am3d="http://schemas.microsoft.com/office/drawing/2017/model3d" xmlns:o="urn:schemas-microsoft-com:office:office" xmlns:oel="http://schemas.microsoft.com/office/2019/extlst" xmlns:r="http://schemas.openxmlformats.org/officeDocument/2006/relationships" xmlns:m="http://schemas.openxmlformats.org/officeDocument/2006/math" xmlns:v="urn:schemas-microsoft-com:vml" xmlns:wp14="http://schemas.microsoft.com/office/word/2010/wordprocessingDrawing" xmlns:wp="http://schemas.openxmlformats.org/drawingml/2006/wordprocessingDrawing" xmlns:w10="urn:schemas-microsoft-com:office:word" xmlns:w="http://schemas.openxmlformats.org/wordprocessingml/2006/main" xmlns:w14="http://schemas.microsoft.com/office/word/2010/wordml" xmlns:w15="http://schemas.microsoft.com/office/word/2012/wordml" xmlns:w16cex="http://schemas.microsoft.com/office/word/2018/wordml/cex" xmlns:w16cid="http://schemas.microsoft.com/office/word/2016/wordml/cid" xmlns:w16="http://schemas.microsoft.com/office/word/2018/wordml" xmlns:w16du="http://schemas.microsoft.com/office/word/2023/wordml/word16du" xmlns:w16sdtdh="http://schemas.microsoft.com/office/word/2020/wordml/sdtdatahash" xmlns:w16sdtfl="http://schemas.microsoft.com/office/word/2024/wordml/sdtformatlock" xmlns:w16se="http://schemas.microsoft.com/office/word/2015/wordml/symex" xmlns:wpg="http://schemas.microsoft.com/office/word/2010/wordprocessingGroup" xmlns:wpi="http://schemas.microsoft.com/office/word/2010/wordprocessingInk" xmlns:wne="http://schemas.microsoft.com/office/word/2006/wordml" xmlns:wps="http://schemas.microsoft.com/office/word/2010/wordprocessingShape" mc:Ignorable="w14 w15 w16se w16cid w16 w16cex w16sdtdh w16sdtfl w16du wp14">
+  <w:footnote w:type="separator" w:id="-1">
+    <w:p>
+      <w:pPr>
+        <w:spacing w:after="0"/>
+      </w:pPr>
+      <w:r>
+        <w:separator/>
+      </w:r>
+    </w:p>
+  </w:footnote>
+  <w:footnote w:type="continuationSeparator" w:id="0">
+    <w:p>
+      <w:pPr>
+        <w:spacing w:after="0"/>
+      </w:pPr>
+      <w:r>
+        <w:continuationSeparator/>
+      </w:r>
+    </w:p>
+  </w:footnote>
+</w:footnotes>
+</file>
+
 <file path=word/numbering.xml><?xml version="1.0" encoding="utf-8"?>
 <w:numbering xmlns:wpc="http://schemas.microsoft.com/office/word/2010/wordprocessingCanvas" xmlns:cx="http://schemas.microsoft.com/office/drawing/2014/chartex" xmlns:cx1="http://schemas.microsoft.com/office/drawing/2015/9/8/chartex" xmlns:cx2="http://schemas.microsoft.com/office/drawing/2015/10/21/chartex" xmlns:cx3="http://schemas.microsoft.com/office/drawing/2016/5/9/chartex" xmlns:cx4="http://schemas.microsoft.com/office/drawing/2016/5/10/chartex" xmlns:cx5="http://schemas.microsoft.com/office/drawing/2016/5/11/chartex" xmlns:cx6="http://schemas.microsoft.com/office/drawing/2016/5/12/chartex" xmlns:cx7="http://schemas.microsoft.com/office/drawing/2016/5/13/chartex" xmlns:cx8="http://schemas.microsoft.com/office/drawing/2016/5/14/chartex" xmlns:mc="http://schemas.openxmlformats.org/markup-compatibility/2006" xmlns:aink="http://schemas.microsoft.com/office/drawing/2016/ink" xmlns:am3d="http://schemas.microsoft.com/office/drawing/2017/model3d" xmlns:o="urn:schemas-microsoft-com:office:office" xmlns:oel="http://schemas.microsoft.com/office/2019/extlst" xmlns:r="http://schemas.openxmlformats.org/officeDocument/2006/relationships" xmlns:m="http://schemas.openxmlformats.org/officeDocument/2006/math" xmlns:v="urn:schemas-microsoft-com:vml" xmlns:wp14="http://schemas.microsoft.com/office/word/2010/wordprocessingDrawing" xmlns:wp="http://schemas.openxmlformats.org/drawingml/2006/wordprocessingDrawing" xmlns:w10="urn:schemas-microsoft-com:office:word" xmlns:w="http://schemas.openxmlformats.org/wordprocessingml/2006/main" xmlns:w14="http://schemas.microsoft.com/office/word/2010/wordml" xmlns:w15="http://schemas.microsoft.com/office/word/2012/wordml" xmlns:w16cex="http://schemas.microsoft.com/office/word/2018/wordml/cex" xmlns:w16cid="http://schemas.microsoft.com/office/word/2016/wordml/cid" xmlns:w16="http://schemas.microsoft.com/office/word/2018/wordml" xmlns:w16du="http://schemas.microsoft.com/office/word/2023/wordml/word16du" xmlns:w16sdtdh="http://schemas.microsoft.com/office/word/2020/wordml/sdtdatahash" xmlns:w16sdtfl="http://schemas.microsoft.com/office/word/2024/wordml/sdtformatlock" xmlns:w16se="http://schemas.microsoft.com/office/word/2015/wordml/symex" xmlns:wpg="http://schemas.microsoft.com/office/word/2010/wordprocessingGroup" xmlns:wpi="http://schemas.microsoft.com/office/word/2010/wordprocessingInk" xmlns:wne="http://schemas.microsoft.com/office/word/2006/wordml" xmlns:wps="http://schemas.microsoft.com/office/word/2010/wordprocessingShape" mc:Ignorable="w14 w15 w16se w16cid w16 w16cex w16sdtdh w16sdtfl w16du wp14">
   <w:abstractNum w:abstractNumId="0" w15:restartNumberingAfterBreak="0">
     <w:nsid w:val="0000A990"/>
     <w:multiLevelType w:val="multilevel"/>
-    <w:tmpl w:val="EA569552"/>
+    <w:tmpl w:val="FD205EEC"/>
     <w:lvl w:ilvl="0">
       <w:numFmt w:val="bullet"/>
       <w:lvlText w:val=" "/>
@@ -13426,115 +14274,8 @@
       </w:pPr>
     </w:lvl>
   </w:abstractNum>
-  <w:abstractNum w:abstractNumId="1" w15:restartNumberingAfterBreak="0">
-    <w:nsid w:val="0000A991"/>
-    <w:multiLevelType w:val="multilevel"/>
-    <w:tmpl w:val="EFA8B520"/>
-    <w:lvl w:ilvl="0">
-      <w:numFmt w:val="bullet"/>
-      <w:lvlText w:val=""/>
-      <w:lvlJc w:val="left"/>
-      <w:pPr>
-        <w:ind w:left="720" w:hanging="360"/>
-      </w:pPr>
-      <w:rPr>
-        <w:rFonts w:ascii="Symbol" w:hAnsi="Symbol" w:cs="Symbol" w:hint="default"/>
-      </w:rPr>
-    </w:lvl>
-    <w:lvl w:ilvl="1">
-      <w:numFmt w:val="bullet"/>
-      <w:lvlText w:val="o"/>
-      <w:lvlJc w:val="left"/>
-      <w:pPr>
-        <w:ind w:left="1440" w:hanging="360"/>
-      </w:pPr>
-      <w:rPr>
-        <w:rFonts w:ascii="Courier New" w:hAnsi="Courier New" w:cs="Courier New" w:hint="default"/>
-      </w:rPr>
-    </w:lvl>
-    <w:lvl w:ilvl="2">
-      <w:numFmt w:val="bullet"/>
-      <w:lvlText w:val=""/>
-      <w:lvlJc w:val="left"/>
-      <w:pPr>
-        <w:ind w:left="2160" w:hanging="360"/>
-      </w:pPr>
-      <w:rPr>
-        <w:rFonts w:ascii="Wingdings" w:hAnsi="Wingdings" w:cs="Wingdings" w:hint="default"/>
-      </w:rPr>
-    </w:lvl>
-    <w:lvl w:ilvl="3">
-      <w:numFmt w:val="bullet"/>
-      <w:lvlText w:val=""/>
-      <w:lvlJc w:val="left"/>
-      <w:pPr>
-        <w:ind w:left="2880" w:hanging="360"/>
-      </w:pPr>
-      <w:rPr>
-        <w:rFonts w:ascii="Symbol" w:hAnsi="Symbol" w:cs="Symbol" w:hint="default"/>
-      </w:rPr>
-    </w:lvl>
-    <w:lvl w:ilvl="4">
-      <w:numFmt w:val="bullet"/>
-      <w:lvlText w:val="o"/>
-      <w:lvlJc w:val="left"/>
-      <w:pPr>
-        <w:ind w:left="3600" w:hanging="360"/>
-      </w:pPr>
-      <w:rPr>
-        <w:rFonts w:ascii="Courier New" w:hAnsi="Courier New" w:cs="Courier New" w:hint="default"/>
-      </w:rPr>
-    </w:lvl>
-    <w:lvl w:ilvl="5">
-      <w:numFmt w:val="bullet"/>
-      <w:lvlText w:val=""/>
-      <w:lvlJc w:val="left"/>
-      <w:pPr>
-        <w:ind w:left="4320" w:hanging="360"/>
-      </w:pPr>
-      <w:rPr>
-        <w:rFonts w:ascii="Wingdings" w:hAnsi="Wingdings" w:cs="Wingdings" w:hint="default"/>
-      </w:rPr>
-    </w:lvl>
-    <w:lvl w:ilvl="6">
-      <w:numFmt w:val="bullet"/>
-      <w:lvlText w:val=""/>
-      <w:lvlJc w:val="left"/>
-      <w:pPr>
-        <w:ind w:left="5040" w:hanging="360"/>
-      </w:pPr>
-      <w:rPr>
-        <w:rFonts w:ascii="Symbol" w:hAnsi="Symbol" w:cs="Symbol" w:hint="default"/>
-      </w:rPr>
-    </w:lvl>
-    <w:lvl w:ilvl="7">
-      <w:numFmt w:val="bullet"/>
-      <w:lvlText w:val="o"/>
-      <w:lvlJc w:val="left"/>
-      <w:pPr>
-        <w:ind w:left="5760" w:hanging="360"/>
-      </w:pPr>
-      <w:rPr>
-        <w:rFonts w:ascii="Courier New" w:hAnsi="Courier New" w:cs="Courier New" w:hint="default"/>
-      </w:rPr>
-    </w:lvl>
-    <w:lvl w:ilvl="8">
-      <w:numFmt w:val="bullet"/>
-      <w:lvlText w:val=""/>
-      <w:lvlJc w:val="left"/>
-      <w:pPr>
-        <w:ind w:left="6480" w:hanging="360"/>
-      </w:pPr>
-      <w:rPr>
-        <w:rFonts w:ascii="Wingdings" w:hAnsi="Wingdings" w:cs="Wingdings" w:hint="default"/>
-      </w:rPr>
-    </w:lvl>
-  </w:abstractNum>
-  <w:num w:numId="1" w16cid:durableId="1681470509">
+  <w:num w:numId="1" w16cid:durableId="1057127453">
     <w:abstractNumId w:val="0"/>
-  </w:num>
-  <w:num w:numId="2" w16cid:durableId="142044040">
-    <w:abstractNumId w:val="1"/>
   </w:num>
 </w:numbering>
 </file>
@@ -14748,14 +15489,43 @@
       <w:sz w:val="22"/>
     </w:rPr>
   </w:style>
-  <w:style w:type="character" w:styleId="Hipervnculovisitado">
-    <w:name w:val="FollowedHyperlink"/>
+  <w:style w:type="paragraph" w:styleId="Encabezado">
+    <w:name w:val="header"/>
+    <w:basedOn w:val="Normal"/>
+    <w:link w:val="EncabezadoCar"/>
+    <w:rsid w:val="00A72F4D"/>
+    <w:pPr>
+      <w:tabs>
+        <w:tab w:val="center" w:pos="4680"/>
+        <w:tab w:val="right" w:pos="9360"/>
+      </w:tabs>
+      <w:spacing w:after="0"/>
+    </w:pPr>
+  </w:style>
+  <w:style w:type="character" w:customStyle="1" w:styleId="EncabezadoCar">
+    <w:name w:val="Encabezado Car"/>
     <w:basedOn w:val="Fuentedeprrafopredeter"/>
-    <w:rsid w:val="00A36713"/>
-    <w:rPr>
-      <w:color w:val="96607D" w:themeColor="followedHyperlink"/>
-      <w:u w:val="single"/>
-    </w:rPr>
+    <w:link w:val="Encabezado"/>
+    <w:rsid w:val="00A72F4D"/>
+  </w:style>
+  <w:style w:type="paragraph" w:styleId="Piedepgina">
+    <w:name w:val="footer"/>
+    <w:basedOn w:val="Normal"/>
+    <w:link w:val="PiedepginaCar"/>
+    <w:rsid w:val="00A72F4D"/>
+    <w:pPr>
+      <w:tabs>
+        <w:tab w:val="center" w:pos="4680"/>
+        <w:tab w:val="right" w:pos="9360"/>
+      </w:tabs>
+      <w:spacing w:after="0"/>
+    </w:pPr>
+  </w:style>
+  <w:style w:type="character" w:customStyle="1" w:styleId="PiedepginaCar">
+    <w:name w:val="Pie de página Car"/>
+    <w:basedOn w:val="Fuentedeprrafopredeter"/>
+    <w:link w:val="Piedepgina"/>
+    <w:rsid w:val="00A72F4D"/>
   </w:style>
 </w:styles>
 </file>

</xml_diff>